<commit_message>
hit an issue with impossible alignment due to gps error
will discuss with chris bird tomorrow
</commit_message>
<xml_diff>
--- a/Notes/Worklog.docx
+++ b/Notes/Worklog.docx
@@ -48,6 +48,14 @@
         </w:rPr>
         <w:t>hese are things I observed and decisions I made.</w:t>
       </w:r>
+      <w:r>
+        <w:rPr>
+          <w:rFonts w:ascii="Arial" w:hAnsi="Arial" w:cs="Arial"/>
+          <w:sz w:val="20"/>
+          <w:szCs w:val="20"/>
+        </w:rPr>
+        <w:t xml:space="preserve"> It is for my own sake of thinking-out-loud more than anything.</w:t>
+      </w:r>
     </w:p>
     <w:p>
       <w:pPr>
@@ -96,7 +104,25 @@
           <w:sz w:val="20"/>
           <w:szCs w:val="20"/>
         </w:rPr>
-        <w:t>Found that the devices had turned on and off as much as 26 times during the deployment. It seems that most of these are maybe the death-throws of the battery. In the big Cahuna data, there was 11 straight days and then 23 times of being turned on for a few seconds. Decided to delete any events that were less than 1 hour (because we couldn't get any meaningful data out of them anyway, really).</w:t>
+        <w:t xml:space="preserve">Found that the devices had turned on and off as much as 26 times during the deployment. It seems that most of these are maybe the death-throws of the battery. In the big </w:t>
+      </w:r>
+      <w:proofErr w:type="spellStart"/>
+      <w:r>
+        <w:rPr>
+          <w:rFonts w:ascii="Arial" w:hAnsi="Arial" w:cs="Arial"/>
+          <w:sz w:val="20"/>
+          <w:szCs w:val="20"/>
+        </w:rPr>
+        <w:t>Cahuna</w:t>
+      </w:r>
+      <w:proofErr w:type="spellEnd"/>
+      <w:r>
+        <w:rPr>
+          <w:rFonts w:ascii="Arial" w:hAnsi="Arial" w:cs="Arial"/>
+          <w:sz w:val="20"/>
+          <w:szCs w:val="20"/>
+        </w:rPr>
+        <w:t xml:space="preserve"> data, there was 11 straight days and then 23 times of being turned on for a few seconds. Decided to delete any events that were less than 1 hour (because we couldn't get any meaningful data out of them anyway, really).</w:t>
       </w:r>
       <w:r>
         <w:rPr>
@@ -198,7 +224,43 @@
           <w:sz w:val="20"/>
           <w:szCs w:val="20"/>
         </w:rPr>
-        <w:t>. Exploring the gps_data directly but found that sometimes the internal clock had tweaked and shown only a few seconds elapsed when the gps_timestamp showed that really a lot of time elapsed.</w:t>
+        <w:t xml:space="preserve">. Exploring the </w:t>
+      </w:r>
+      <w:proofErr w:type="spellStart"/>
+      <w:r>
+        <w:rPr>
+          <w:rFonts w:ascii="Arial" w:hAnsi="Arial" w:cs="Arial"/>
+          <w:sz w:val="20"/>
+          <w:szCs w:val="20"/>
+        </w:rPr>
+        <w:t>gps_data</w:t>
+      </w:r>
+      <w:proofErr w:type="spellEnd"/>
+      <w:r>
+        <w:rPr>
+          <w:rFonts w:ascii="Arial" w:hAnsi="Arial" w:cs="Arial"/>
+          <w:sz w:val="20"/>
+          <w:szCs w:val="20"/>
+        </w:rPr>
+        <w:t xml:space="preserve"> directly but found that sometimes the internal clock had tweaked and shown only a few seconds elapsed when the </w:t>
+      </w:r>
+      <w:proofErr w:type="spellStart"/>
+      <w:r>
+        <w:rPr>
+          <w:rFonts w:ascii="Arial" w:hAnsi="Arial" w:cs="Arial"/>
+          <w:sz w:val="20"/>
+          <w:szCs w:val="20"/>
+        </w:rPr>
+        <w:t>gps_timestamp</w:t>
+      </w:r>
+      <w:proofErr w:type="spellEnd"/>
+      <w:r>
+        <w:rPr>
+          <w:rFonts w:ascii="Arial" w:hAnsi="Arial" w:cs="Arial"/>
+          <w:sz w:val="20"/>
+          <w:szCs w:val="20"/>
+        </w:rPr>
+        <w:t xml:space="preserve"> showed that really a lot of time elapsed.</w:t>
       </w:r>
       <w:r>
         <w:rPr>
@@ -275,7 +337,25 @@
           <w:sz w:val="20"/>
           <w:szCs w:val="20"/>
         </w:rPr>
-        <w:t>This could easily have happened if there was corruption in the artemis writing to file (there’s a lot of corruption). Let’s go check the relevant file…</w:t>
+        <w:t xml:space="preserve">This could easily have happened if there was corruption in the </w:t>
+      </w:r>
+      <w:proofErr w:type="spellStart"/>
+      <w:r>
+        <w:rPr>
+          <w:rFonts w:ascii="Arial" w:hAnsi="Arial" w:cs="Arial"/>
+          <w:sz w:val="20"/>
+          <w:szCs w:val="20"/>
+        </w:rPr>
+        <w:t>artemis</w:t>
+      </w:r>
+      <w:proofErr w:type="spellEnd"/>
+      <w:r>
+        <w:rPr>
+          <w:rFonts w:ascii="Arial" w:hAnsi="Arial" w:cs="Arial"/>
+          <w:sz w:val="20"/>
+          <w:szCs w:val="20"/>
+        </w:rPr>
+        <w:t xml:space="preserve"> writing to file (there’s a lot of corruption). Let’s go check the relevant file…</w:t>
       </w:r>
     </w:p>
     <w:p>
@@ -312,7 +392,6 @@
       <w:r>
         <w:rPr>
           <w:rFonts w:ascii="Arial" w:hAnsi="Arial" w:cs="Arial"/>
-          <w:noProof/>
           <w:sz w:val="20"/>
           <w:szCs w:val="20"/>
         </w:rPr>
@@ -422,7 +501,7 @@
           </mc:Choice>
           <mc:Fallback>
             <w:pict>
-              <v:group w14:anchorId="00A4D895" id="Group 25" o:spid="_x0000_s1026" style="position:absolute;margin-left:183.3pt;margin-top:1.85pt;width:40.5pt;height:60.8pt;z-index:251668480" coordsize="5144,7721" o:gfxdata="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">
+              <v:group w14:anchorId="5005C8CE" id="Group 25" o:spid="_x0000_s1026" style="position:absolute;margin-left:183.3pt;margin-top:1.85pt;width:40.5pt;height:60.8pt;z-index:251668480" coordsize="5144,7721" o:gfxdata="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">
                 <v:shapetype id="_x0000_t75" coordsize="21600,21600" o:spt="75" o:preferrelative="t" path="m@4@5l@4@11@9@11@9@5xe" filled="f" stroked="f">
                   <v:stroke joinstyle="miter"/>
                   <v:formulas>
@@ -471,7 +550,6 @@
       <w:r>
         <w:rPr>
           <w:rFonts w:ascii="Arial" w:hAnsi="Arial" w:cs="Arial"/>
-          <w:noProof/>
           <w:sz w:val="20"/>
           <w:szCs w:val="20"/>
         </w:rPr>
@@ -509,7 +587,7 @@
           </mc:Choice>
           <mc:Fallback>
             <w:pict>
-              <v:shape w14:anchorId="488A3BFF" id="Ink 23" o:spid="_x0000_s1026" type="#_x0000_t75" style="position:absolute;margin-left:208.35pt;margin-top:26.05pt;width:5.65pt;height:10.05pt;z-index:251666432;visibility:visible;mso-wrap-style:square;mso-wrap-distance-left:9pt;mso-wrap-distance-top:0;mso-wrap-distance-right:9pt;mso-wrap-distance-bottom:0;mso-position-horizontal:absolute;mso-position-horizontal-relative:text;mso-position-vertical:absolute;mso-position-vertical-relative:text" o:gfxdata="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">
+              <v:shape w14:anchorId="0B634C61" id="Ink 23" o:spid="_x0000_s1026" type="#_x0000_t75" style="position:absolute;margin-left:208.35pt;margin-top:26.05pt;width:5.65pt;height:10.05pt;z-index:251666432;visibility:visible;mso-wrap-style:square;mso-wrap-distance-left:9pt;mso-wrap-distance-top:0;mso-wrap-distance-right:9pt;mso-wrap-distance-bottom:0;mso-position-horizontal:absolute;mso-position-horizontal-relative:text;mso-position-vertical:absolute;mso-position-vertical-relative:text" o:gfxdata="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">
                 <v:imagedata r:id="rId23" o:title=""/>
               </v:shape>
             </w:pict>
@@ -519,7 +597,6 @@
       <w:r>
         <w:rPr>
           <w:rFonts w:ascii="Arial" w:hAnsi="Arial" w:cs="Arial"/>
-          <w:noProof/>
           <w:sz w:val="20"/>
           <w:szCs w:val="20"/>
         </w:rPr>
@@ -557,7 +634,7 @@
           </mc:Choice>
           <mc:Fallback>
             <w:pict>
-              <v:shape w14:anchorId="5CA58EC8" id="Ink 22" o:spid="_x0000_s1026" type="#_x0000_t75" style="position:absolute;margin-left:208.2pt;margin-top:4.05pt;width:7.1pt;height:8.5pt;z-index:251665408;visibility:visible;mso-wrap-style:square;mso-wrap-distance-left:9pt;mso-wrap-distance-top:0;mso-wrap-distance-right:9pt;mso-wrap-distance-bottom:0;mso-position-horizontal:absolute;mso-position-horizontal-relative:text;mso-position-vertical:absolute;mso-position-vertical-relative:text" o:gfxdata="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">
+              <v:shape w14:anchorId="43388ADF" id="Ink 22" o:spid="_x0000_s1026" type="#_x0000_t75" style="position:absolute;margin-left:208.2pt;margin-top:4.05pt;width:7.1pt;height:8.5pt;z-index:251665408;visibility:visible;mso-wrap-style:square;mso-wrap-distance-left:9pt;mso-wrap-distance-top:0;mso-wrap-distance-right:9pt;mso-wrap-distance-bottom:0;mso-position-horizontal:absolute;mso-position-horizontal-relative:text;mso-position-vertical:absolute;mso-position-vertical-relative:text" o:gfxdata="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">
                 <v:imagedata r:id="rId25" o:title=""/>
               </v:shape>
             </w:pict>
@@ -643,16 +720,44 @@
           <w:sz w:val="20"/>
           <w:szCs w:val="20"/>
         </w:rPr>
-        <w:t xml:space="preserve">change the internal timestamp so it’s a relative change between the gps_timestamps. </w:t>
-      </w:r>
-      <w:r>
-        <w:rPr>
-          <w:rFonts w:ascii="Arial" w:hAnsi="Arial" w:cs="Arial"/>
-          <w:sz w:val="20"/>
-          <w:szCs w:val="20"/>
-        </w:rPr>
-        <w:t>Because I don’t want to affect the other timestamps, I will just re-interpolate when the reads occur on the same internal_timestamp</w:t>
-      </w:r>
+        <w:t xml:space="preserve">change the internal timestamp so it’s a relative change between the </w:t>
+      </w:r>
+      <w:proofErr w:type="spellStart"/>
+      <w:r>
+        <w:rPr>
+          <w:rFonts w:ascii="Arial" w:hAnsi="Arial" w:cs="Arial"/>
+          <w:sz w:val="20"/>
+          <w:szCs w:val="20"/>
+        </w:rPr>
+        <w:t>gps_timestamps</w:t>
+      </w:r>
+      <w:proofErr w:type="spellEnd"/>
+      <w:r>
+        <w:rPr>
+          <w:rFonts w:ascii="Arial" w:hAnsi="Arial" w:cs="Arial"/>
+          <w:sz w:val="20"/>
+          <w:szCs w:val="20"/>
+        </w:rPr>
+        <w:t xml:space="preserve">. </w:t>
+      </w:r>
+      <w:r>
+        <w:rPr>
+          <w:rFonts w:ascii="Arial" w:hAnsi="Arial" w:cs="Arial"/>
+          <w:sz w:val="20"/>
+          <w:szCs w:val="20"/>
+        </w:rPr>
+        <w:t xml:space="preserve">Because I don’t want to affect the other timestamps, I will just re-interpolate when the reads occur on the same </w:t>
+      </w:r>
+      <w:proofErr w:type="spellStart"/>
+      <w:r>
+        <w:rPr>
+          <w:rFonts w:ascii="Arial" w:hAnsi="Arial" w:cs="Arial"/>
+          <w:sz w:val="20"/>
+          <w:szCs w:val="20"/>
+        </w:rPr>
+        <w:t>internal_timestamp</w:t>
+      </w:r>
+      <w:proofErr w:type="spellEnd"/>
       <w:r>
         <w:rPr>
           <w:rFonts w:ascii="Arial" w:hAnsi="Arial" w:cs="Arial"/>
@@ -819,13 +924,642 @@
     </w:p>
     <w:p>
       <w:pPr>
+        <w:pStyle w:val="Heading3"/>
+        <w:rPr>
+          <w:rFonts w:ascii="Arial" w:hAnsi="Arial" w:cs="Arial"/>
+        </w:rPr>
+      </w:pPr>
+      <w:r>
+        <w:rPr>
+          <w:rFonts w:ascii="Arial" w:hAnsi="Arial" w:cs="Arial"/>
+        </w:rPr>
+        <w:t>1</w:t>
+      </w:r>
+      <w:r>
+        <w:rPr>
+          <w:rFonts w:ascii="Arial" w:hAnsi="Arial" w:cs="Arial"/>
+        </w:rPr>
+        <w:t>1</w:t>
+      </w:r>
+      <w:r>
+        <w:rPr>
+          <w:rFonts w:ascii="Arial" w:hAnsi="Arial" w:cs="Arial"/>
+        </w:rPr>
+        <w:t>/03</w:t>
+      </w:r>
+    </w:p>
+    <w:p>
+      <w:pPr>
+        <w:pStyle w:val="ListParagraph"/>
+        <w:numPr>
+          <w:ilvl w:val="0"/>
+          <w:numId w:val="8"/>
+        </w:numPr>
+        <w:rPr>
+          <w:rFonts w:ascii="Arial" w:hAnsi="Arial" w:cs="Arial"/>
+          <w:sz w:val="20"/>
+          <w:szCs w:val="20"/>
+        </w:rPr>
+      </w:pPr>
+      <w:r>
+        <w:rPr>
+          <w:rFonts w:ascii="Arial" w:hAnsi="Arial" w:cs="Arial"/>
+          <w:sz w:val="20"/>
+          <w:szCs w:val="20"/>
+        </w:rPr>
+        <w:t>I now have the metadata of when sampling started and stopped. Going to select only those days and then visualise the remainder to see what I’m working with.</w:t>
+      </w:r>
+    </w:p>
+    <w:p>
+      <w:pPr>
+        <w:pStyle w:val="ListParagraph"/>
+        <w:numPr>
+          <w:ilvl w:val="0"/>
+          <w:numId w:val="8"/>
+        </w:numPr>
+        <w:rPr>
+          <w:rFonts w:ascii="Arial" w:hAnsi="Arial" w:cs="Arial"/>
+          <w:sz w:val="20"/>
+          <w:szCs w:val="20"/>
+        </w:rPr>
+      </w:pPr>
+      <w:r>
+        <w:rPr>
+          <w:rFonts w:ascii="Arial" w:hAnsi="Arial" w:cs="Arial"/>
+          <w:sz w:val="20"/>
+          <w:szCs w:val="20"/>
+        </w:rPr>
+        <w:t>Here is an example of what it looks like visually:</w:t>
+      </w:r>
+    </w:p>
+    <w:p>
+      <w:pPr>
+        <w:pStyle w:val="NormalWeb"/>
+        <w:spacing w:before="0" w:beforeAutospacing="0" w:after="0" w:afterAutospacing="0"/>
+        <w:ind w:left="360"/>
+      </w:pPr>
+      <w:r>
+        <w:rPr>
+          <w:noProof/>
+        </w:rPr>
+        <w:drawing>
+          <wp:inline distT="0" distB="0" distL="0" distR="0" wp14:anchorId="3C3B7E0E" wp14:editId="3C421402">
+            <wp:extent cx="5633074" cy="1875886"/>
+            <wp:effectExtent l="0" t="0" r="6350" b="0"/>
+            <wp:docPr id="87501362" name="Picture 26"/>
+            <wp:cNvGraphicFramePr>
+              <a:graphicFrameLocks xmlns:a="http://schemas.openxmlformats.org/drawingml/2006/main" noChangeAspect="1"/>
+            </wp:cNvGraphicFramePr>
+            <a:graphic xmlns:a="http://schemas.openxmlformats.org/drawingml/2006/main">
+              <a:graphicData uri="http://schemas.openxmlformats.org/drawingml/2006/picture">
+                <pic:pic xmlns:pic="http://schemas.openxmlformats.org/drawingml/2006/picture">
+                  <pic:nvPicPr>
+                    <pic:cNvPr id="0" name="Picture 1"/>
+                    <pic:cNvPicPr>
+                      <a:picLocks noChangeAspect="1" noChangeArrowheads="1"/>
+                    </pic:cNvPicPr>
+                  </pic:nvPicPr>
+                  <pic:blipFill>
+                    <a:blip r:embed="rId28">
+                      <a:extLst>
+                        <a:ext uri="{28A0092B-C50C-407E-A947-70E740481C1C}">
+                          <a14:useLocalDpi xmlns:a14="http://schemas.microsoft.com/office/drawing/2010/main" val="0"/>
+                        </a:ext>
+                      </a:extLst>
+                    </a:blip>
+                    <a:srcRect/>
+                    <a:stretch>
+                      <a:fillRect/>
+                    </a:stretch>
+                  </pic:blipFill>
+                  <pic:spPr bwMode="auto">
+                    <a:xfrm>
+                      <a:off x="0" y="0"/>
+                      <a:ext cx="5679794" cy="1891444"/>
+                    </a:xfrm>
+                    <a:prstGeom prst="rect">
+                      <a:avLst/>
+                    </a:prstGeom>
+                    <a:noFill/>
+                    <a:ln>
+                      <a:noFill/>
+                    </a:ln>
+                  </pic:spPr>
+                </pic:pic>
+              </a:graphicData>
+            </a:graphic>
+          </wp:inline>
+        </w:drawing>
+      </w:r>
+    </w:p>
+    <w:p>
+      <w:pPr>
+        <w:pStyle w:val="NormalWeb"/>
+        <w:spacing w:before="0" w:beforeAutospacing="0" w:after="0" w:afterAutospacing="0"/>
+        <w:ind w:left="360"/>
+        <w:rPr>
+          <w:rFonts w:ascii="Arial" w:hAnsi="Arial" w:cs="Arial"/>
+          <w:sz w:val="20"/>
+          <w:szCs w:val="20"/>
+        </w:rPr>
+      </w:pPr>
+      <w:r>
+        <w:drawing>
+          <wp:inline distT="0" distB="0" distL="0" distR="0" wp14:anchorId="6AF22F26" wp14:editId="08EFE176">
+            <wp:extent cx="5538159" cy="1846053"/>
+            <wp:effectExtent l="0" t="0" r="5715" b="1905"/>
+            <wp:docPr id="406205248" name="Picture 29"/>
+            <wp:cNvGraphicFramePr>
+              <a:graphicFrameLocks xmlns:a="http://schemas.openxmlformats.org/drawingml/2006/main" noChangeAspect="1"/>
+            </wp:cNvGraphicFramePr>
+            <a:graphic xmlns:a="http://schemas.openxmlformats.org/drawingml/2006/main">
+              <a:graphicData uri="http://schemas.openxmlformats.org/drawingml/2006/picture">
+                <pic:pic xmlns:pic="http://schemas.openxmlformats.org/drawingml/2006/picture">
+                  <pic:nvPicPr>
+                    <pic:cNvPr id="0" name="Picture 10"/>
+                    <pic:cNvPicPr>
+                      <a:picLocks noChangeAspect="1" noChangeArrowheads="1"/>
+                    </pic:cNvPicPr>
+                  </pic:nvPicPr>
+                  <pic:blipFill>
+                    <a:blip r:embed="rId29">
+                      <a:extLst>
+                        <a:ext uri="{28A0092B-C50C-407E-A947-70E740481C1C}">
+                          <a14:useLocalDpi xmlns:a14="http://schemas.microsoft.com/office/drawing/2010/main" val="0"/>
+                        </a:ext>
+                      </a:extLst>
+                    </a:blip>
+                    <a:srcRect/>
+                    <a:stretch>
+                      <a:fillRect/>
+                    </a:stretch>
+                  </pic:blipFill>
+                  <pic:spPr bwMode="auto">
+                    <a:xfrm>
+                      <a:off x="0" y="0"/>
+                      <a:ext cx="5555461" cy="1851820"/>
+                    </a:xfrm>
+                    <a:prstGeom prst="rect">
+                      <a:avLst/>
+                    </a:prstGeom>
+                    <a:noFill/>
+                    <a:ln>
+                      <a:noFill/>
+                    </a:ln>
+                  </pic:spPr>
+                </pic:pic>
+              </a:graphicData>
+            </a:graphic>
+          </wp:inline>
+        </w:drawing>
+      </w:r>
+    </w:p>
+    <w:p>
+      <w:pPr>
+        <w:pStyle w:val="NormalWeb"/>
+        <w:numPr>
+          <w:ilvl w:val="1"/>
+          <w:numId w:val="8"/>
+        </w:numPr>
+        <w:spacing w:before="0" w:beforeAutospacing="0"/>
+        <w:rPr>
+          <w:rFonts w:ascii="Arial" w:hAnsi="Arial" w:cs="Arial"/>
+          <w:sz w:val="20"/>
+          <w:szCs w:val="20"/>
+        </w:rPr>
+      </w:pPr>
+      <w:r>
+        <w:rPr>
+          <w:rFonts w:ascii="Arial" w:hAnsi="Arial" w:cs="Arial"/>
+          <w:sz w:val="20"/>
+          <w:szCs w:val="20"/>
+        </w:rPr>
+        <w:t>From quick visual inspection, I can’t see any obvious issues. But nor am I seeing what I might expect in terms of big hops. I feel like we are seeing consistent sleep/inactivity periods though, which is a good sign.</w:t>
+      </w:r>
+    </w:p>
+    <w:p>
+      <w:pPr>
+        <w:pStyle w:val="NormalWeb"/>
+        <w:numPr>
+          <w:ilvl w:val="0"/>
+          <w:numId w:val="8"/>
+        </w:numPr>
+        <w:spacing w:before="0" w:beforeAutospacing="0"/>
+        <w:rPr>
+          <w:rFonts w:ascii="Arial" w:hAnsi="Arial" w:cs="Arial"/>
+          <w:sz w:val="20"/>
+          <w:szCs w:val="20"/>
+        </w:rPr>
+      </w:pPr>
+      <w:r>
+        <w:rPr>
+          <w:rFonts w:ascii="Arial" w:hAnsi="Arial" w:cs="Arial"/>
+          <w:sz w:val="20"/>
+          <w:szCs w:val="20"/>
+        </w:rPr>
+        <w:t xml:space="preserve">And yet, when I try to pull the correct section from the accel, </w:t>
+      </w:r>
+      <w:r>
+        <w:rPr>
+          <w:rFonts w:ascii="Arial" w:hAnsi="Arial" w:cs="Arial"/>
+          <w:sz w:val="20"/>
+          <w:szCs w:val="20"/>
+        </w:rPr>
+        <w:t xml:space="preserve">it is just some random section of the data… HUH. There has to be some kind of time-zone issue. Maybe the </w:t>
+      </w:r>
+      <w:proofErr w:type="spellStart"/>
+      <w:r>
+        <w:rPr>
+          <w:rFonts w:ascii="Arial" w:hAnsi="Arial" w:cs="Arial"/>
+          <w:sz w:val="20"/>
+          <w:szCs w:val="20"/>
+        </w:rPr>
+        <w:t>timezone</w:t>
+      </w:r>
+      <w:proofErr w:type="spellEnd"/>
+      <w:r>
+        <w:rPr>
+          <w:rFonts w:ascii="Arial" w:hAnsi="Arial" w:cs="Arial"/>
+          <w:sz w:val="20"/>
+          <w:szCs w:val="20"/>
+        </w:rPr>
+        <w:t xml:space="preserve"> of the drone is not as expected? </w:t>
+      </w:r>
+      <w:r>
+        <w:rPr>
+          <w:rFonts w:ascii="Arial" w:hAnsi="Arial" w:cs="Arial"/>
+          <w:sz w:val="20"/>
+          <w:szCs w:val="20"/>
+        </w:rPr>
+        <w:t xml:space="preserve">Apparently </w:t>
+      </w:r>
+      <w:proofErr w:type="spellStart"/>
+      <w:r>
+        <w:rPr>
+          <w:rFonts w:ascii="Arial" w:hAnsi="Arial" w:cs="Arial"/>
+          <w:sz w:val="20"/>
+          <w:szCs w:val="20"/>
+        </w:rPr>
+        <w:t>POSIXct</w:t>
+      </w:r>
+      <w:proofErr w:type="spellEnd"/>
+      <w:r>
+        <w:rPr>
+          <w:rFonts w:ascii="Arial" w:hAnsi="Arial" w:cs="Arial"/>
+          <w:sz w:val="20"/>
+          <w:szCs w:val="20"/>
+        </w:rPr>
+        <w:t xml:space="preserve"> coped with daylight savings automatically but one can never be too sure.</w:t>
+      </w:r>
+      <w:r>
+        <w:rPr>
+          <w:rFonts w:ascii="Arial" w:hAnsi="Arial" w:cs="Arial"/>
+          <w:sz w:val="20"/>
+          <w:szCs w:val="20"/>
+        </w:rPr>
+        <w:t xml:space="preserve"> We conducted this research in Fowler’s Gap, NSW, but are from Brisbane, QLD.</w:t>
+      </w:r>
+    </w:p>
+    <w:p>
+      <w:pPr>
+        <w:pStyle w:val="NormalWeb"/>
+        <w:numPr>
+          <w:ilvl w:val="1"/>
+          <w:numId w:val="8"/>
+        </w:numPr>
+        <w:spacing w:before="0" w:beforeAutospacing="0"/>
+        <w:rPr>
+          <w:rFonts w:ascii="Arial" w:hAnsi="Arial" w:cs="Arial"/>
+          <w:sz w:val="20"/>
+          <w:szCs w:val="20"/>
+        </w:rPr>
+      </w:pPr>
+      <w:r>
+        <w:rPr>
+          <w:rFonts w:ascii="Arial" w:hAnsi="Arial" w:cs="Arial"/>
+          <w:sz w:val="20"/>
+          <w:szCs w:val="20"/>
+        </w:rPr>
+        <w:t xml:space="preserve">Sydney </w:t>
+      </w:r>
+      <w:r>
+        <w:rPr>
+          <w:rFonts w:ascii="Arial" w:hAnsi="Arial" w:cs="Arial"/>
+          <w:sz w:val="20"/>
+          <w:szCs w:val="20"/>
+        </w:rPr>
+        <w:t>in winter: UTC+10</w:t>
+      </w:r>
+      <w:r>
+        <w:rPr>
+          <w:rFonts w:ascii="Arial" w:hAnsi="Arial" w:cs="Arial"/>
+          <w:sz w:val="20"/>
+          <w:szCs w:val="20"/>
+        </w:rPr>
+        <w:t xml:space="preserve"> (</w:t>
+      </w:r>
+      <w:r>
+        <w:rPr>
+          <w:rFonts w:ascii="Arial" w:hAnsi="Arial" w:cs="Arial"/>
+          <w:sz w:val="20"/>
+          <w:szCs w:val="20"/>
+        </w:rPr>
+        <w:t>AEST</w:t>
+      </w:r>
+      <w:r>
+        <w:rPr>
+          <w:rFonts w:ascii="Arial" w:hAnsi="Arial" w:cs="Arial"/>
+          <w:sz w:val="20"/>
+          <w:szCs w:val="20"/>
+        </w:rPr>
+        <w:t>)</w:t>
+      </w:r>
+      <w:r>
+        <w:rPr>
+          <w:rFonts w:ascii="Arial" w:hAnsi="Arial" w:cs="Arial"/>
+          <w:sz w:val="20"/>
+          <w:szCs w:val="20"/>
+        </w:rPr>
+        <w:t xml:space="preserve"> (also the same as Brisbane) </w:t>
+      </w:r>
+      <w:r>
+        <w:rPr>
+          <w:rFonts w:ascii="Arial" w:hAnsi="Arial" w:cs="Arial"/>
+          <w:sz w:val="20"/>
+          <w:szCs w:val="20"/>
+        </w:rPr>
+        <w:sym w:font="Wingdings" w:char="F0E0"/>
+      </w:r>
+      <w:r>
+        <w:rPr>
+          <w:rFonts w:ascii="Arial" w:hAnsi="Arial" w:cs="Arial"/>
+          <w:sz w:val="20"/>
+          <w:szCs w:val="20"/>
+        </w:rPr>
+        <w:t xml:space="preserve"> No</w:t>
+      </w:r>
+    </w:p>
+    <w:p>
+      <w:pPr>
+        <w:pStyle w:val="NormalWeb"/>
+        <w:numPr>
+          <w:ilvl w:val="1"/>
+          <w:numId w:val="8"/>
+        </w:numPr>
+        <w:spacing w:before="0" w:beforeAutospacing="0"/>
+        <w:rPr>
+          <w:rFonts w:ascii="Arial" w:hAnsi="Arial" w:cs="Arial"/>
+          <w:sz w:val="20"/>
+          <w:szCs w:val="20"/>
+        </w:rPr>
+      </w:pPr>
+      <w:r>
+        <w:rPr>
+          <w:rFonts w:ascii="Arial" w:hAnsi="Arial" w:cs="Arial"/>
+          <w:sz w:val="20"/>
+          <w:szCs w:val="20"/>
+        </w:rPr>
+        <w:t>Sydney</w:t>
+      </w:r>
+      <w:r>
+        <w:rPr>
+          <w:rFonts w:ascii="Arial" w:hAnsi="Arial" w:cs="Arial"/>
+          <w:sz w:val="20"/>
+          <w:szCs w:val="20"/>
+        </w:rPr>
+        <w:t xml:space="preserve"> in summer: UTC+11</w:t>
+      </w:r>
+      <w:r>
+        <w:rPr>
+          <w:rFonts w:ascii="Arial" w:hAnsi="Arial" w:cs="Arial"/>
+          <w:sz w:val="20"/>
+          <w:szCs w:val="20"/>
+        </w:rPr>
+        <w:t xml:space="preserve"> (</w:t>
+      </w:r>
+      <w:r>
+        <w:rPr>
+          <w:rFonts w:ascii="Arial" w:hAnsi="Arial" w:cs="Arial"/>
+          <w:sz w:val="20"/>
+          <w:szCs w:val="20"/>
+        </w:rPr>
+        <w:t>AEDT</w:t>
+      </w:r>
+      <w:r>
+        <w:rPr>
+          <w:rFonts w:ascii="Arial" w:hAnsi="Arial" w:cs="Arial"/>
+          <w:sz w:val="20"/>
+          <w:szCs w:val="20"/>
+        </w:rPr>
+        <w:t>)</w:t>
+      </w:r>
+      <w:r>
+        <w:rPr>
+          <w:rFonts w:ascii="Arial" w:hAnsi="Arial" w:cs="Arial"/>
+          <w:sz w:val="20"/>
+          <w:szCs w:val="20"/>
+        </w:rPr>
+        <w:t xml:space="preserve"> </w:t>
+      </w:r>
+      <w:r>
+        <w:rPr>
+          <w:rFonts w:ascii="Arial" w:hAnsi="Arial" w:cs="Arial"/>
+          <w:sz w:val="20"/>
+          <w:szCs w:val="20"/>
+        </w:rPr>
+        <w:sym w:font="Wingdings" w:char="F0E0"/>
+      </w:r>
+      <w:r>
+        <w:rPr>
+          <w:rFonts w:ascii="Arial" w:hAnsi="Arial" w:cs="Arial"/>
+          <w:sz w:val="20"/>
+          <w:szCs w:val="20"/>
+        </w:rPr>
+        <w:t xml:space="preserve"> apparently this is already taken into account</w:t>
+      </w:r>
+    </w:p>
+    <w:p>
+      <w:pPr>
+        <w:pStyle w:val="NormalWeb"/>
+        <w:numPr>
+          <w:ilvl w:val="1"/>
+          <w:numId w:val="8"/>
+        </w:numPr>
+        <w:spacing w:before="0" w:beforeAutospacing="0"/>
+        <w:rPr>
+          <w:rFonts w:ascii="Arial" w:hAnsi="Arial" w:cs="Arial"/>
+          <w:sz w:val="20"/>
+          <w:szCs w:val="20"/>
+        </w:rPr>
+      </w:pPr>
+      <w:r>
+        <w:rPr>
+          <w:rFonts w:ascii="Arial" w:hAnsi="Arial" w:cs="Arial"/>
+          <w:sz w:val="20"/>
+          <w:szCs w:val="20"/>
+        </w:rPr>
+        <w:t>Adelaide in winter: UTC+9:30</w:t>
+      </w:r>
+      <w:r>
+        <w:rPr>
+          <w:rFonts w:ascii="Arial" w:hAnsi="Arial" w:cs="Arial"/>
+          <w:sz w:val="20"/>
+          <w:szCs w:val="20"/>
+        </w:rPr>
+        <w:t xml:space="preserve"> </w:t>
+      </w:r>
+      <w:r>
+        <w:rPr>
+          <w:rFonts w:ascii="Arial" w:hAnsi="Arial" w:cs="Arial"/>
+          <w:sz w:val="20"/>
+          <w:szCs w:val="20"/>
+        </w:rPr>
+        <w:t>(</w:t>
+      </w:r>
+      <w:r>
+        <w:rPr>
+          <w:rFonts w:ascii="Arial" w:hAnsi="Arial" w:cs="Arial"/>
+          <w:sz w:val="20"/>
+          <w:szCs w:val="20"/>
+        </w:rPr>
+        <w:t>A</w:t>
+      </w:r>
+      <w:r>
+        <w:rPr>
+          <w:rFonts w:ascii="Arial" w:hAnsi="Arial" w:cs="Arial"/>
+          <w:sz w:val="20"/>
+          <w:szCs w:val="20"/>
+        </w:rPr>
+        <w:t>CST)</w:t>
+      </w:r>
+      <w:r>
+        <w:rPr>
+          <w:rFonts w:ascii="Arial" w:hAnsi="Arial" w:cs="Arial"/>
+          <w:sz w:val="20"/>
+          <w:szCs w:val="20"/>
+        </w:rPr>
+        <w:t xml:space="preserve"> </w:t>
+      </w:r>
+      <w:r>
+        <w:rPr>
+          <w:rFonts w:ascii="Arial" w:hAnsi="Arial" w:cs="Arial"/>
+          <w:sz w:val="20"/>
+          <w:szCs w:val="20"/>
+        </w:rPr>
+        <w:sym w:font="Wingdings" w:char="F0E0"/>
+      </w:r>
+      <w:r>
+        <w:rPr>
+          <w:rFonts w:ascii="Arial" w:hAnsi="Arial" w:cs="Arial"/>
+          <w:sz w:val="20"/>
+          <w:szCs w:val="20"/>
+        </w:rPr>
+        <w:t xml:space="preserve"> No</w:t>
+      </w:r>
+    </w:p>
+    <w:p>
+      <w:pPr>
+        <w:pStyle w:val="NormalWeb"/>
+        <w:spacing w:before="0" w:beforeAutospacing="0"/>
+        <w:rPr>
+          <w:rFonts w:ascii="Arial" w:hAnsi="Arial" w:cs="Arial"/>
+          <w:sz w:val="20"/>
+          <w:szCs w:val="20"/>
+        </w:rPr>
+      </w:pPr>
+    </w:p>
+    <w:p>
+      <w:pPr>
+        <w:pStyle w:val="NormalWeb"/>
+        <w:numPr>
+          <w:ilvl w:val="0"/>
+          <w:numId w:val="8"/>
+        </w:numPr>
+        <w:spacing w:before="0" w:beforeAutospacing="0"/>
+        <w:rPr>
+          <w:rFonts w:ascii="Arial" w:hAnsi="Arial" w:cs="Arial"/>
+          <w:sz w:val="20"/>
+          <w:szCs w:val="20"/>
+        </w:rPr>
+      </w:pPr>
+      <w:r>
+        <w:rPr>
+          <w:rFonts w:ascii="Arial" w:hAnsi="Arial" w:cs="Arial"/>
+          <w:sz w:val="20"/>
+          <w:szCs w:val="20"/>
+        </w:rPr>
+        <w:lastRenderedPageBreak/>
+        <w:t>I’m realizing that the internal timestamp being wrong is probably the issue</w:t>
+      </w:r>
+    </w:p>
+    <w:p>
+      <w:pPr>
+        <w:pStyle w:val="NormalWeb"/>
+        <w:numPr>
+          <w:ilvl w:val="0"/>
+          <w:numId w:val="8"/>
+        </w:numPr>
+        <w:spacing w:before="0" w:beforeAutospacing="0"/>
+        <w:rPr>
+          <w:rFonts w:ascii="Arial" w:hAnsi="Arial" w:cs="Arial"/>
+          <w:sz w:val="20"/>
+          <w:szCs w:val="20"/>
+        </w:rPr>
+      </w:pPr>
+      <w:r>
+        <w:rPr>
+          <w:rFonts w:ascii="Arial" w:hAnsi="Arial" w:cs="Arial"/>
+          <w:sz w:val="20"/>
+          <w:szCs w:val="20"/>
+        </w:rPr>
+        <w:t xml:space="preserve">Need to check whether the </w:t>
+      </w:r>
+      <w:proofErr w:type="spellStart"/>
+      <w:r>
+        <w:rPr>
+          <w:rFonts w:ascii="Arial" w:hAnsi="Arial" w:cs="Arial"/>
+          <w:sz w:val="20"/>
+          <w:szCs w:val="20"/>
+        </w:rPr>
+        <w:t>acceleromeyer</w:t>
+      </w:r>
+      <w:proofErr w:type="spellEnd"/>
+      <w:r>
+        <w:rPr>
+          <w:rFonts w:ascii="Arial" w:hAnsi="Arial" w:cs="Arial"/>
+          <w:sz w:val="20"/>
+          <w:szCs w:val="20"/>
+        </w:rPr>
+        <w:t xml:space="preserve"> also shows the problem, then it must be a board fault. If the accelerometer is normal, then it’s an issue with the serial communication between the board and the </w:t>
+      </w:r>
+      <w:proofErr w:type="spellStart"/>
+      <w:r>
+        <w:rPr>
+          <w:rFonts w:ascii="Arial" w:hAnsi="Arial" w:cs="Arial"/>
+          <w:sz w:val="20"/>
+          <w:szCs w:val="20"/>
+        </w:rPr>
+        <w:t>gos</w:t>
+      </w:r>
+      <w:proofErr w:type="spellEnd"/>
+      <w:r>
+        <w:rPr>
+          <w:rFonts w:ascii="Arial" w:hAnsi="Arial" w:cs="Arial"/>
+          <w:sz w:val="20"/>
+          <w:szCs w:val="20"/>
+        </w:rPr>
+        <w:t xml:space="preserve"> </w:t>
+      </w:r>
+    </w:p>
+    <w:p>
+      <w:pPr>
         <w:rPr>
           <w:rFonts w:ascii="Arial" w:hAnsi="Arial" w:cs="Arial"/>
         </w:rPr>
       </w:pPr>
     </w:p>
     <w:sectPr>
-      <w:headerReference w:type="default" r:id="rId28"/>
+      <w:headerReference w:type="default" r:id="rId30"/>
       <w:pgSz w:w="12240" w:h="15840"/>
       <w:pgMar w:top="1440" w:right="1440" w:bottom="1440" w:left="1440" w:header="720" w:footer="720" w:gutter="0"/>
       <w:cols w:space="720"/>
@@ -902,6 +1636,230 @@
 <file path=word/numbering.xml><?xml version="1.0" encoding="utf-8"?>
 <w:numbering xmlns:wpc="http://schemas.microsoft.com/office/word/2010/wordprocessingCanvas" xmlns:cx="http://schemas.microsoft.com/office/drawing/2014/chartex" xmlns:cx1="http://schemas.microsoft.com/office/drawing/2015/9/8/chartex" xmlns:cx2="http://schemas.microsoft.com/office/drawing/2015/10/21/chartex" xmlns:cx3="http://schemas.microsoft.com/office/drawing/2016/5/9/chartex" xmlns:cx4="http://schemas.microsoft.com/office/drawing/2016/5/10/chartex" xmlns:cx5="http://schemas.microsoft.com/office/drawing/2016/5/11/chartex" xmlns:cx6="http://schemas.microsoft.com/office/drawing/2016/5/12/chartex" xmlns:cx7="http://schemas.microsoft.com/office/drawing/2016/5/13/chartex" xmlns:cx8="http://schemas.microsoft.com/office/drawing/2016/5/14/chartex" xmlns:mc="http://schemas.openxmlformats.org/markup-compatibility/2006" xmlns:aink="http://schemas.microsoft.com/office/drawing/2016/ink" xmlns:am3d="http://schemas.microsoft.com/office/drawing/2017/model3d" xmlns:o="urn:schemas-microsoft-com:office:office" xmlns:oel="http://schemas.microsoft.com/office/2019/extlst" xmlns:r="http://schemas.openxmlformats.org/officeDocument/2006/relationships" xmlns:m="http://schemas.openxmlformats.org/officeDocument/2006/math" xmlns:v="urn:schemas-microsoft-com:vml" xmlns:wp14="http://schemas.microsoft.com/office/word/2010/wordprocessingDrawing" xmlns:wp="http://schemas.openxmlformats.org/drawingml/2006/wordprocessingDrawing" xmlns:w10="urn:schemas-microsoft-com:office:word" xmlns:w="http://schemas.openxmlformats.org/wordprocessingml/2006/main" xmlns:w14="http://schemas.microsoft.com/office/word/2010/wordml" xmlns:w15="http://schemas.microsoft.com/office/word/2012/wordml" xmlns:w16cex="http://schemas.microsoft.com/office/word/2018/wordml/cex" xmlns:w16cid="http://schemas.microsoft.com/office/word/2016/wordml/cid" xmlns:w16="http://schemas.microsoft.com/office/word/2018/wordml" xmlns:w16du="http://schemas.microsoft.com/office/word/2023/wordml/word16du" xmlns:w16sdtdh="http://schemas.microsoft.com/office/word/2020/wordml/sdtdatahash" xmlns:w16sdtfl="http://schemas.microsoft.com/office/word/2024/wordml/sdtformatlock" xmlns:w16se="http://schemas.microsoft.com/office/word/2015/wordml/symex" xmlns:wpg="http://schemas.microsoft.com/office/word/2010/wordprocessingGroup" xmlns:wpi="http://schemas.microsoft.com/office/word/2010/wordprocessingInk" xmlns:wne="http://schemas.microsoft.com/office/word/2006/wordml" xmlns:wps="http://schemas.microsoft.com/office/word/2010/wordprocessingShape" mc:Ignorable="w14 w15 w16se w16cid w16 w16cex w16sdtdh w16sdtfl w16du wp14">
   <w:abstractNum w:abstractNumId="0" w15:restartNumberingAfterBreak="0">
+    <w:nsid w:val="28AE5541"/>
+    <w:multiLevelType w:val="hybridMultilevel"/>
+    <w:tmpl w:val="D116E5BE"/>
+    <w:lvl w:ilvl="0" w:tplc="7E62F234">
+      <w:numFmt w:val="bullet"/>
+      <w:lvlText w:val="-"/>
+      <w:lvlJc w:val="left"/>
+      <w:pPr>
+        <w:ind w:left="720" w:hanging="360"/>
+      </w:pPr>
+      <w:rPr>
+        <w:rFonts w:ascii="Aptos" w:eastAsiaTheme="minorHAnsi" w:hAnsi="Aptos" w:cstheme="minorBidi" w:hint="default"/>
+      </w:rPr>
+    </w:lvl>
+    <w:lvl w:ilvl="1" w:tplc="04090003" w:tentative="1">
+      <w:start w:val="1"/>
+      <w:numFmt w:val="bullet"/>
+      <w:lvlText w:val="o"/>
+      <w:lvlJc w:val="left"/>
+      <w:pPr>
+        <w:ind w:left="1440" w:hanging="360"/>
+      </w:pPr>
+      <w:rPr>
+        <w:rFonts w:ascii="Courier New" w:hAnsi="Courier New" w:cs="Courier New" w:hint="default"/>
+      </w:rPr>
+    </w:lvl>
+    <w:lvl w:ilvl="2" w:tplc="04090005" w:tentative="1">
+      <w:start w:val="1"/>
+      <w:numFmt w:val="bullet"/>
+      <w:lvlText w:val=""/>
+      <w:lvlJc w:val="left"/>
+      <w:pPr>
+        <w:ind w:left="2160" w:hanging="360"/>
+      </w:pPr>
+      <w:rPr>
+        <w:rFonts w:ascii="Wingdings" w:hAnsi="Wingdings" w:hint="default"/>
+      </w:rPr>
+    </w:lvl>
+    <w:lvl w:ilvl="3" w:tplc="04090001" w:tentative="1">
+      <w:start w:val="1"/>
+      <w:numFmt w:val="bullet"/>
+      <w:lvlText w:val=""/>
+      <w:lvlJc w:val="left"/>
+      <w:pPr>
+        <w:ind w:left="2880" w:hanging="360"/>
+      </w:pPr>
+      <w:rPr>
+        <w:rFonts w:ascii="Symbol" w:hAnsi="Symbol" w:hint="default"/>
+      </w:rPr>
+    </w:lvl>
+    <w:lvl w:ilvl="4" w:tplc="04090003" w:tentative="1">
+      <w:start w:val="1"/>
+      <w:numFmt w:val="bullet"/>
+      <w:lvlText w:val="o"/>
+      <w:lvlJc w:val="left"/>
+      <w:pPr>
+        <w:ind w:left="3600" w:hanging="360"/>
+      </w:pPr>
+      <w:rPr>
+        <w:rFonts w:ascii="Courier New" w:hAnsi="Courier New" w:cs="Courier New" w:hint="default"/>
+      </w:rPr>
+    </w:lvl>
+    <w:lvl w:ilvl="5" w:tplc="04090005" w:tentative="1">
+      <w:start w:val="1"/>
+      <w:numFmt w:val="bullet"/>
+      <w:lvlText w:val=""/>
+      <w:lvlJc w:val="left"/>
+      <w:pPr>
+        <w:ind w:left="4320" w:hanging="360"/>
+      </w:pPr>
+      <w:rPr>
+        <w:rFonts w:ascii="Wingdings" w:hAnsi="Wingdings" w:hint="default"/>
+      </w:rPr>
+    </w:lvl>
+    <w:lvl w:ilvl="6" w:tplc="04090001" w:tentative="1">
+      <w:start w:val="1"/>
+      <w:numFmt w:val="bullet"/>
+      <w:lvlText w:val=""/>
+      <w:lvlJc w:val="left"/>
+      <w:pPr>
+        <w:ind w:left="5040" w:hanging="360"/>
+      </w:pPr>
+      <w:rPr>
+        <w:rFonts w:ascii="Symbol" w:hAnsi="Symbol" w:hint="default"/>
+      </w:rPr>
+    </w:lvl>
+    <w:lvl w:ilvl="7" w:tplc="04090003" w:tentative="1">
+      <w:start w:val="1"/>
+      <w:numFmt w:val="bullet"/>
+      <w:lvlText w:val="o"/>
+      <w:lvlJc w:val="left"/>
+      <w:pPr>
+        <w:ind w:left="5760" w:hanging="360"/>
+      </w:pPr>
+      <w:rPr>
+        <w:rFonts w:ascii="Courier New" w:hAnsi="Courier New" w:cs="Courier New" w:hint="default"/>
+      </w:rPr>
+    </w:lvl>
+    <w:lvl w:ilvl="8" w:tplc="04090005" w:tentative="1">
+      <w:start w:val="1"/>
+      <w:numFmt w:val="bullet"/>
+      <w:lvlText w:val=""/>
+      <w:lvlJc w:val="left"/>
+      <w:pPr>
+        <w:ind w:left="6480" w:hanging="360"/>
+      </w:pPr>
+      <w:rPr>
+        <w:rFonts w:ascii="Wingdings" w:hAnsi="Wingdings" w:hint="default"/>
+      </w:rPr>
+    </w:lvl>
+  </w:abstractNum>
+  <w:abstractNum w:abstractNumId="1" w15:restartNumberingAfterBreak="0">
+    <w:nsid w:val="33626D7F"/>
+    <w:multiLevelType w:val="hybridMultilevel"/>
+    <w:tmpl w:val="38AC6682"/>
+    <w:lvl w:ilvl="0" w:tplc="7E62F234">
+      <w:numFmt w:val="bullet"/>
+      <w:lvlText w:val="-"/>
+      <w:lvlJc w:val="left"/>
+      <w:pPr>
+        <w:ind w:left="720" w:hanging="360"/>
+      </w:pPr>
+      <w:rPr>
+        <w:rFonts w:ascii="Aptos" w:eastAsiaTheme="minorHAnsi" w:hAnsi="Aptos" w:cstheme="minorBidi" w:hint="default"/>
+      </w:rPr>
+    </w:lvl>
+    <w:lvl w:ilvl="1" w:tplc="04090003" w:tentative="1">
+      <w:start w:val="1"/>
+      <w:numFmt w:val="bullet"/>
+      <w:lvlText w:val="o"/>
+      <w:lvlJc w:val="left"/>
+      <w:pPr>
+        <w:ind w:left="1440" w:hanging="360"/>
+      </w:pPr>
+      <w:rPr>
+        <w:rFonts w:ascii="Courier New" w:hAnsi="Courier New" w:cs="Courier New" w:hint="default"/>
+      </w:rPr>
+    </w:lvl>
+    <w:lvl w:ilvl="2" w:tplc="04090005" w:tentative="1">
+      <w:start w:val="1"/>
+      <w:numFmt w:val="bullet"/>
+      <w:lvlText w:val=""/>
+      <w:lvlJc w:val="left"/>
+      <w:pPr>
+        <w:ind w:left="2160" w:hanging="360"/>
+      </w:pPr>
+      <w:rPr>
+        <w:rFonts w:ascii="Wingdings" w:hAnsi="Wingdings" w:hint="default"/>
+      </w:rPr>
+    </w:lvl>
+    <w:lvl w:ilvl="3" w:tplc="04090001" w:tentative="1">
+      <w:start w:val="1"/>
+      <w:numFmt w:val="bullet"/>
+      <w:lvlText w:val=""/>
+      <w:lvlJc w:val="left"/>
+      <w:pPr>
+        <w:ind w:left="2880" w:hanging="360"/>
+      </w:pPr>
+      <w:rPr>
+        <w:rFonts w:ascii="Symbol" w:hAnsi="Symbol" w:hint="default"/>
+      </w:rPr>
+    </w:lvl>
+    <w:lvl w:ilvl="4" w:tplc="04090003" w:tentative="1">
+      <w:start w:val="1"/>
+      <w:numFmt w:val="bullet"/>
+      <w:lvlText w:val="o"/>
+      <w:lvlJc w:val="left"/>
+      <w:pPr>
+        <w:ind w:left="3600" w:hanging="360"/>
+      </w:pPr>
+      <w:rPr>
+        <w:rFonts w:ascii="Courier New" w:hAnsi="Courier New" w:cs="Courier New" w:hint="default"/>
+      </w:rPr>
+    </w:lvl>
+    <w:lvl w:ilvl="5" w:tplc="04090005" w:tentative="1">
+      <w:start w:val="1"/>
+      <w:numFmt w:val="bullet"/>
+      <w:lvlText w:val=""/>
+      <w:lvlJc w:val="left"/>
+      <w:pPr>
+        <w:ind w:left="4320" w:hanging="360"/>
+      </w:pPr>
+      <w:rPr>
+        <w:rFonts w:ascii="Wingdings" w:hAnsi="Wingdings" w:hint="default"/>
+      </w:rPr>
+    </w:lvl>
+    <w:lvl w:ilvl="6" w:tplc="04090001" w:tentative="1">
+      <w:start w:val="1"/>
+      <w:numFmt w:val="bullet"/>
+      <w:lvlText w:val=""/>
+      <w:lvlJc w:val="left"/>
+      <w:pPr>
+        <w:ind w:left="5040" w:hanging="360"/>
+      </w:pPr>
+      <w:rPr>
+        <w:rFonts w:ascii="Symbol" w:hAnsi="Symbol" w:hint="default"/>
+      </w:rPr>
+    </w:lvl>
+    <w:lvl w:ilvl="7" w:tplc="04090003" w:tentative="1">
+      <w:start w:val="1"/>
+      <w:numFmt w:val="bullet"/>
+      <w:lvlText w:val="o"/>
+      <w:lvlJc w:val="left"/>
+      <w:pPr>
+        <w:ind w:left="5760" w:hanging="360"/>
+      </w:pPr>
+      <w:rPr>
+        <w:rFonts w:ascii="Courier New" w:hAnsi="Courier New" w:cs="Courier New" w:hint="default"/>
+      </w:rPr>
+    </w:lvl>
+    <w:lvl w:ilvl="8" w:tplc="04090005" w:tentative="1">
+      <w:start w:val="1"/>
+      <w:numFmt w:val="bullet"/>
+      <w:lvlText w:val=""/>
+      <w:lvlJc w:val="left"/>
+      <w:pPr>
+        <w:ind w:left="6480" w:hanging="360"/>
+      </w:pPr>
+      <w:rPr>
+        <w:rFonts w:ascii="Wingdings" w:hAnsi="Wingdings" w:hint="default"/>
+      </w:rPr>
+    </w:lvl>
+  </w:abstractNum>
+  <w:abstractNum w:abstractNumId="2" w15:restartNumberingAfterBreak="0">
     <w:nsid w:val="38497A60"/>
     <w:multiLevelType w:val="hybridMultilevel"/>
     <w:tmpl w:val="83442E46"/>
@@ -1014,7 +1972,120 @@
       </w:rPr>
     </w:lvl>
   </w:abstractNum>
-  <w:abstractNum w:abstractNumId="1" w15:restartNumberingAfterBreak="0">
+  <w:abstractNum w:abstractNumId="3" w15:restartNumberingAfterBreak="0">
+    <w:nsid w:val="3B7536DB"/>
+    <w:multiLevelType w:val="hybridMultilevel"/>
+    <w:tmpl w:val="CAC21054"/>
+    <w:lvl w:ilvl="0" w:tplc="68224392">
+      <w:numFmt w:val="bullet"/>
+      <w:lvlText w:val="-"/>
+      <w:lvlJc w:val="left"/>
+      <w:pPr>
+        <w:ind w:left="720" w:hanging="360"/>
+      </w:pPr>
+      <w:rPr>
+        <w:rFonts w:ascii="Aptos" w:eastAsiaTheme="minorHAnsi" w:hAnsi="Aptos" w:cstheme="minorBidi" w:hint="default"/>
+        <w:sz w:val="24"/>
+      </w:rPr>
+    </w:lvl>
+    <w:lvl w:ilvl="1" w:tplc="04090003">
+      <w:start w:val="1"/>
+      <w:numFmt w:val="bullet"/>
+      <w:lvlText w:val="o"/>
+      <w:lvlJc w:val="left"/>
+      <w:pPr>
+        <w:ind w:left="1440" w:hanging="360"/>
+      </w:pPr>
+      <w:rPr>
+        <w:rFonts w:ascii="Courier New" w:hAnsi="Courier New" w:cs="Courier New" w:hint="default"/>
+      </w:rPr>
+    </w:lvl>
+    <w:lvl w:ilvl="2" w:tplc="04090005" w:tentative="1">
+      <w:start w:val="1"/>
+      <w:numFmt w:val="bullet"/>
+      <w:lvlText w:val=""/>
+      <w:lvlJc w:val="left"/>
+      <w:pPr>
+        <w:ind w:left="2160" w:hanging="360"/>
+      </w:pPr>
+      <w:rPr>
+        <w:rFonts w:ascii="Wingdings" w:hAnsi="Wingdings" w:hint="default"/>
+      </w:rPr>
+    </w:lvl>
+    <w:lvl w:ilvl="3" w:tplc="04090001" w:tentative="1">
+      <w:start w:val="1"/>
+      <w:numFmt w:val="bullet"/>
+      <w:lvlText w:val=""/>
+      <w:lvlJc w:val="left"/>
+      <w:pPr>
+        <w:ind w:left="2880" w:hanging="360"/>
+      </w:pPr>
+      <w:rPr>
+        <w:rFonts w:ascii="Symbol" w:hAnsi="Symbol" w:hint="default"/>
+      </w:rPr>
+    </w:lvl>
+    <w:lvl w:ilvl="4" w:tplc="04090003" w:tentative="1">
+      <w:start w:val="1"/>
+      <w:numFmt w:val="bullet"/>
+      <w:lvlText w:val="o"/>
+      <w:lvlJc w:val="left"/>
+      <w:pPr>
+        <w:ind w:left="3600" w:hanging="360"/>
+      </w:pPr>
+      <w:rPr>
+        <w:rFonts w:ascii="Courier New" w:hAnsi="Courier New" w:cs="Courier New" w:hint="default"/>
+      </w:rPr>
+    </w:lvl>
+    <w:lvl w:ilvl="5" w:tplc="04090005" w:tentative="1">
+      <w:start w:val="1"/>
+      <w:numFmt w:val="bullet"/>
+      <w:lvlText w:val=""/>
+      <w:lvlJc w:val="left"/>
+      <w:pPr>
+        <w:ind w:left="4320" w:hanging="360"/>
+      </w:pPr>
+      <w:rPr>
+        <w:rFonts w:ascii="Wingdings" w:hAnsi="Wingdings" w:hint="default"/>
+      </w:rPr>
+    </w:lvl>
+    <w:lvl w:ilvl="6" w:tplc="04090001" w:tentative="1">
+      <w:start w:val="1"/>
+      <w:numFmt w:val="bullet"/>
+      <w:lvlText w:val=""/>
+      <w:lvlJc w:val="left"/>
+      <w:pPr>
+        <w:ind w:left="5040" w:hanging="360"/>
+      </w:pPr>
+      <w:rPr>
+        <w:rFonts w:ascii="Symbol" w:hAnsi="Symbol" w:hint="default"/>
+      </w:rPr>
+    </w:lvl>
+    <w:lvl w:ilvl="7" w:tplc="04090003" w:tentative="1">
+      <w:start w:val="1"/>
+      <w:numFmt w:val="bullet"/>
+      <w:lvlText w:val="o"/>
+      <w:lvlJc w:val="left"/>
+      <w:pPr>
+        <w:ind w:left="5760" w:hanging="360"/>
+      </w:pPr>
+      <w:rPr>
+        <w:rFonts w:ascii="Courier New" w:hAnsi="Courier New" w:cs="Courier New" w:hint="default"/>
+      </w:rPr>
+    </w:lvl>
+    <w:lvl w:ilvl="8" w:tplc="04090005" w:tentative="1">
+      <w:start w:val="1"/>
+      <w:numFmt w:val="bullet"/>
+      <w:lvlText w:val=""/>
+      <w:lvlJc w:val="left"/>
+      <w:pPr>
+        <w:ind w:left="6480" w:hanging="360"/>
+      </w:pPr>
+      <w:rPr>
+        <w:rFonts w:ascii="Wingdings" w:hAnsi="Wingdings" w:hint="default"/>
+      </w:rPr>
+    </w:lvl>
+  </w:abstractNum>
+  <w:abstractNum w:abstractNumId="4" w15:restartNumberingAfterBreak="0">
     <w:nsid w:val="48DC534A"/>
     <w:multiLevelType w:val="hybridMultilevel"/>
     <w:tmpl w:val="4EC0701A"/>
@@ -1126,7 +2197,7 @@
       </w:rPr>
     </w:lvl>
   </w:abstractNum>
-  <w:abstractNum w:abstractNumId="2" w15:restartNumberingAfterBreak="0">
+  <w:abstractNum w:abstractNumId="5" w15:restartNumberingAfterBreak="0">
     <w:nsid w:val="4C510A82"/>
     <w:multiLevelType w:val="hybridMultilevel"/>
     <w:tmpl w:val="BEF09408"/>
@@ -1239,7 +2310,7 @@
       </w:rPr>
     </w:lvl>
   </w:abstractNum>
-  <w:abstractNum w:abstractNumId="3" w15:restartNumberingAfterBreak="0">
+  <w:abstractNum w:abstractNumId="6" w15:restartNumberingAfterBreak="0">
     <w:nsid w:val="5F602AF6"/>
     <w:multiLevelType w:val="hybridMultilevel"/>
     <w:tmpl w:val="BB08D29A"/>
@@ -1351,7 +2422,7 @@
       </w:rPr>
     </w:lvl>
   </w:abstractNum>
-  <w:abstractNum w:abstractNumId="4" w15:restartNumberingAfterBreak="0">
+  <w:abstractNum w:abstractNumId="7" w15:restartNumberingAfterBreak="0">
     <w:nsid w:val="7D0D2DB5"/>
     <w:multiLevelType w:val="hybridMultilevel"/>
     <w:tmpl w:val="5BD0C838"/>
@@ -1464,19 +2535,28 @@
     </w:lvl>
   </w:abstractNum>
   <w:num w:numId="1" w16cid:durableId="451486496">
+    <w:abstractNumId w:val="2"/>
+  </w:num>
+  <w:num w:numId="2" w16cid:durableId="1918205785">
+    <w:abstractNumId w:val="4"/>
+  </w:num>
+  <w:num w:numId="3" w16cid:durableId="1818649609">
+    <w:abstractNumId w:val="7"/>
+  </w:num>
+  <w:num w:numId="4" w16cid:durableId="819468418">
+    <w:abstractNumId w:val="6"/>
+  </w:num>
+  <w:num w:numId="5" w16cid:durableId="1547452141">
+    <w:abstractNumId w:val="5"/>
+  </w:num>
+  <w:num w:numId="6" w16cid:durableId="1398675041">
+    <w:abstractNumId w:val="1"/>
+  </w:num>
+  <w:num w:numId="7" w16cid:durableId="978387788">
     <w:abstractNumId w:val="0"/>
   </w:num>
-  <w:num w:numId="2" w16cid:durableId="1918205785">
-    <w:abstractNumId w:val="1"/>
-  </w:num>
-  <w:num w:numId="3" w16cid:durableId="1818649609">
-    <w:abstractNumId w:val="4"/>
-  </w:num>
-  <w:num w:numId="4" w16cid:durableId="819468418">
+  <w:num w:numId="8" w16cid:durableId="1864630609">
     <w:abstractNumId w:val="3"/>
-  </w:num>
-  <w:num w:numId="5" w16cid:durableId="1547452141">
-    <w:abstractNumId w:val="2"/>
   </w:num>
 </w:numbering>
 </file>
@@ -1881,6 +2961,9 @@
   <w:style w:type="paragraph" w:default="1" w:styleId="Normal">
     <w:name w:val="Normal"/>
     <w:qFormat/>
+    <w:rPr>
+      <w:lang w:val="en-GB"/>
+    </w:rPr>
   </w:style>
   <w:style w:type="paragraph" w:styleId="Heading1">
     <w:name w:val="heading 1"/>
@@ -2436,6 +3519,22 @@
     <w:link w:val="Footer"/>
     <w:uiPriority w:val="99"/>
     <w:rsid w:val="00AA6EE9"/>
+  </w:style>
+  <w:style w:type="paragraph" w:styleId="NormalWeb">
+    <w:name w:val="Normal (Web)"/>
+    <w:basedOn w:val="Normal"/>
+    <w:uiPriority w:val="99"/>
+    <w:unhideWhenUsed/>
+    <w:rsid w:val="003D2F1B"/>
+    <w:pPr>
+      <w:spacing w:before="100" w:beforeAutospacing="1" w:after="100" w:afterAutospacing="1" w:line="240" w:lineRule="auto"/>
+    </w:pPr>
+    <w:rPr>
+      <w:rFonts w:ascii="Times New Roman" w:eastAsia="Times New Roman" w:hAnsi="Times New Roman" w:cs="Times New Roman"/>
+      <w:kern w:val="0"/>
+      <w:lang w:val="en-US"/>
+      <w14:ligatures w14:val="none"/>
+    </w:rPr>
   </w:style>
 </w:styles>
 </file>

</xml_diff>

<commit_message>
small updates and beginning of debug report
</commit_message>
<xml_diff>
--- a/Notes/Worklog.docx
+++ b/Notes/Worklog.docx
@@ -104,25 +104,7 @@
           <w:sz w:val="20"/>
           <w:szCs w:val="20"/>
         </w:rPr>
-        <w:t xml:space="preserve">Found that the devices had turned on and off as much as 26 times during the deployment. It seems that most of these are maybe the death-throws of the battery. In the big </w:t>
-      </w:r>
-      <w:proofErr w:type="spellStart"/>
-      <w:r>
-        <w:rPr>
-          <w:rFonts w:ascii="Arial" w:hAnsi="Arial" w:cs="Arial"/>
-          <w:sz w:val="20"/>
-          <w:szCs w:val="20"/>
-        </w:rPr>
-        <w:t>Cahuna</w:t>
-      </w:r>
-      <w:proofErr w:type="spellEnd"/>
-      <w:r>
-        <w:rPr>
-          <w:rFonts w:ascii="Arial" w:hAnsi="Arial" w:cs="Arial"/>
-          <w:sz w:val="20"/>
-          <w:szCs w:val="20"/>
-        </w:rPr>
-        <w:t xml:space="preserve"> data, there was 11 straight days and then 23 times of being turned on for a few seconds. Decided to delete any events that were less than 1 hour (because we couldn't get any meaningful data out of them anyway, really).</w:t>
+        <w:t>Found that the devices had turned on and off as much as 26 times during the deployment. It seems that most of these are maybe the death-throws of the battery. In the big Cahuna data, there was 11 straight days and then 23 times of being turned on for a few seconds. Decided to delete any events that were less than 1 hour (because we couldn't get any meaningful data out of them anyway, really).</w:t>
       </w:r>
       <w:r>
         <w:rPr>
@@ -168,15 +150,7 @@
           <w:sz w:val="20"/>
           <w:szCs w:val="20"/>
         </w:rPr>
-        <w:t>N</w:t>
-      </w:r>
-      <w:r>
-        <w:rPr>
-          <w:rFonts w:ascii="Arial" w:hAnsi="Arial" w:cs="Arial"/>
-          <w:sz w:val="20"/>
-          <w:szCs w:val="20"/>
-        </w:rPr>
-        <w:t>o</w:t>
+        <w:t>No</w:t>
       </w:r>
       <w:r>
         <w:rPr>
@@ -224,43 +198,7 @@
           <w:sz w:val="20"/>
           <w:szCs w:val="20"/>
         </w:rPr>
-        <w:t xml:space="preserve">. Exploring the </w:t>
-      </w:r>
-      <w:proofErr w:type="spellStart"/>
-      <w:r>
-        <w:rPr>
-          <w:rFonts w:ascii="Arial" w:hAnsi="Arial" w:cs="Arial"/>
-          <w:sz w:val="20"/>
-          <w:szCs w:val="20"/>
-        </w:rPr>
-        <w:t>gps_data</w:t>
-      </w:r>
-      <w:proofErr w:type="spellEnd"/>
-      <w:r>
-        <w:rPr>
-          <w:rFonts w:ascii="Arial" w:hAnsi="Arial" w:cs="Arial"/>
-          <w:sz w:val="20"/>
-          <w:szCs w:val="20"/>
-        </w:rPr>
-        <w:t xml:space="preserve"> directly but found that sometimes the internal clock had tweaked and shown only a few seconds elapsed when the </w:t>
-      </w:r>
-      <w:proofErr w:type="spellStart"/>
-      <w:r>
-        <w:rPr>
-          <w:rFonts w:ascii="Arial" w:hAnsi="Arial" w:cs="Arial"/>
-          <w:sz w:val="20"/>
-          <w:szCs w:val="20"/>
-        </w:rPr>
-        <w:t>gps_timestamp</w:t>
-      </w:r>
-      <w:proofErr w:type="spellEnd"/>
-      <w:r>
-        <w:rPr>
-          <w:rFonts w:ascii="Arial" w:hAnsi="Arial" w:cs="Arial"/>
-          <w:sz w:val="20"/>
-          <w:szCs w:val="20"/>
-        </w:rPr>
-        <w:t xml:space="preserve"> showed that really a lot of time elapsed.</w:t>
+        <w:t>. Exploring the gps_data directly but found that sometimes the internal clock had tweaked and shown only a few seconds elapsed when the gps_timestamp showed that really a lot of time elapsed.</w:t>
       </w:r>
       <w:r>
         <w:rPr>
@@ -281,6 +219,9 @@
         </w:rPr>
       </w:pPr>
       <w:r>
+        <w:rPr>
+          <w:noProof/>
+        </w:rPr>
         <w:drawing>
           <wp:inline distT="0" distB="0" distL="0" distR="0" wp14:anchorId="6CE1802F" wp14:editId="0C08CE8C">
             <wp:extent cx="4784651" cy="930860"/>
@@ -337,25 +278,7 @@
           <w:sz w:val="20"/>
           <w:szCs w:val="20"/>
         </w:rPr>
-        <w:t xml:space="preserve">This could easily have happened if there was corruption in the </w:t>
-      </w:r>
-      <w:proofErr w:type="spellStart"/>
-      <w:r>
-        <w:rPr>
-          <w:rFonts w:ascii="Arial" w:hAnsi="Arial" w:cs="Arial"/>
-          <w:sz w:val="20"/>
-          <w:szCs w:val="20"/>
-        </w:rPr>
-        <w:t>artemis</w:t>
-      </w:r>
-      <w:proofErr w:type="spellEnd"/>
-      <w:r>
-        <w:rPr>
-          <w:rFonts w:ascii="Arial" w:hAnsi="Arial" w:cs="Arial"/>
-          <w:sz w:val="20"/>
-          <w:szCs w:val="20"/>
-        </w:rPr>
-        <w:t xml:space="preserve"> writing to file (there’s a lot of corruption). Let’s go check the relevant file…</w:t>
+        <w:t>This could easily have happened if there was corruption in the artemis writing to file (there’s a lot of corruption). Let’s go check the relevant file…</w:t>
       </w:r>
     </w:p>
     <w:p>
@@ -392,6 +315,7 @@
       <w:r>
         <w:rPr>
           <w:rFonts w:ascii="Arial" w:hAnsi="Arial" w:cs="Arial"/>
+          <w:noProof/>
           <w:sz w:val="20"/>
           <w:szCs w:val="20"/>
         </w:rPr>
@@ -550,6 +474,7 @@
       <w:r>
         <w:rPr>
           <w:rFonts w:ascii="Arial" w:hAnsi="Arial" w:cs="Arial"/>
+          <w:noProof/>
           <w:sz w:val="20"/>
           <w:szCs w:val="20"/>
         </w:rPr>
@@ -597,6 +522,7 @@
       <w:r>
         <w:rPr>
           <w:rFonts w:ascii="Arial" w:hAnsi="Arial" w:cs="Arial"/>
+          <w:noProof/>
           <w:sz w:val="20"/>
           <w:szCs w:val="20"/>
         </w:rPr>
@@ -644,6 +570,7 @@
       <w:r>
         <w:rPr>
           <w:rFonts w:ascii="Arial" w:hAnsi="Arial" w:cs="Arial"/>
+          <w:noProof/>
           <w:sz w:val="20"/>
           <w:szCs w:val="20"/>
         </w:rPr>
@@ -720,44 +647,16 @@
           <w:sz w:val="20"/>
           <w:szCs w:val="20"/>
         </w:rPr>
-        <w:t xml:space="preserve">change the internal timestamp so it’s a relative change between the </w:t>
-      </w:r>
-      <w:proofErr w:type="spellStart"/>
-      <w:r>
-        <w:rPr>
-          <w:rFonts w:ascii="Arial" w:hAnsi="Arial" w:cs="Arial"/>
-          <w:sz w:val="20"/>
-          <w:szCs w:val="20"/>
-        </w:rPr>
-        <w:t>gps_timestamps</w:t>
-      </w:r>
-      <w:proofErr w:type="spellEnd"/>
-      <w:r>
-        <w:rPr>
-          <w:rFonts w:ascii="Arial" w:hAnsi="Arial" w:cs="Arial"/>
-          <w:sz w:val="20"/>
-          <w:szCs w:val="20"/>
-        </w:rPr>
-        <w:t xml:space="preserve">. </w:t>
-      </w:r>
-      <w:r>
-        <w:rPr>
-          <w:rFonts w:ascii="Arial" w:hAnsi="Arial" w:cs="Arial"/>
-          <w:sz w:val="20"/>
-          <w:szCs w:val="20"/>
-        </w:rPr>
-        <w:t xml:space="preserve">Because I don’t want to affect the other timestamps, I will just re-interpolate when the reads occur on the same </w:t>
-      </w:r>
-      <w:proofErr w:type="spellStart"/>
-      <w:r>
-        <w:rPr>
-          <w:rFonts w:ascii="Arial" w:hAnsi="Arial" w:cs="Arial"/>
-          <w:sz w:val="20"/>
-          <w:szCs w:val="20"/>
-        </w:rPr>
-        <w:t>internal_timestamp</w:t>
-      </w:r>
-      <w:proofErr w:type="spellEnd"/>
+        <w:t xml:space="preserve">change the internal timestamp so it’s a relative change between the gps_timestamps. </w:t>
+      </w:r>
+      <w:r>
+        <w:rPr>
+          <w:rFonts w:ascii="Arial" w:hAnsi="Arial" w:cs="Arial"/>
+          <w:sz w:val="20"/>
+          <w:szCs w:val="20"/>
+        </w:rPr>
+        <w:t>Because I don’t want to affect the other timestamps, I will just re-interpolate when the reads occur on the same internal_timestamp</w:t>
+      </w:r>
       <w:r>
         <w:rPr>
           <w:rFonts w:ascii="Arial" w:hAnsi="Arial" w:cs="Arial"/>
@@ -778,6 +677,9 @@
         </w:rPr>
       </w:pPr>
       <w:r>
+        <w:rPr>
+          <w:noProof/>
+        </w:rPr>
         <w:drawing>
           <wp:inline distT="0" distB="0" distL="0" distR="0" wp14:anchorId="6241891B" wp14:editId="22B2F743">
             <wp:extent cx="4136065" cy="942103"/>
@@ -933,19 +835,7 @@
         <w:rPr>
           <w:rFonts w:ascii="Arial" w:hAnsi="Arial" w:cs="Arial"/>
         </w:rPr>
-        <w:t>1</w:t>
-      </w:r>
-      <w:r>
-        <w:rPr>
-          <w:rFonts w:ascii="Arial" w:hAnsi="Arial" w:cs="Arial"/>
-        </w:rPr>
-        <w:t>1</w:t>
-      </w:r>
-      <w:r>
-        <w:rPr>
-          <w:rFonts w:ascii="Arial" w:hAnsi="Arial" w:cs="Arial"/>
-        </w:rPr>
-        <w:t>/03</w:t>
+        <w:t>11/03</w:t>
       </w:r>
     </w:p>
     <w:p>
@@ -1064,6 +954,9 @@
         </w:rPr>
       </w:pPr>
       <w:r>
+        <w:rPr>
+          <w:noProof/>
+        </w:rPr>
         <w:drawing>
           <wp:inline distT="0" distB="0" distL="0" distR="0" wp14:anchorId="6AF22F26" wp14:editId="08EFE176">
             <wp:extent cx="5538159" cy="1846053"/>
@@ -1165,51 +1058,15 @@
           <w:sz w:val="20"/>
           <w:szCs w:val="20"/>
         </w:rPr>
-        <w:t xml:space="preserve">it is just some random section of the data… HUH. There has to be some kind of time-zone issue. Maybe the </w:t>
-      </w:r>
-      <w:proofErr w:type="spellStart"/>
-      <w:r>
-        <w:rPr>
-          <w:rFonts w:ascii="Arial" w:hAnsi="Arial" w:cs="Arial"/>
-          <w:sz w:val="20"/>
-          <w:szCs w:val="20"/>
-        </w:rPr>
-        <w:t>timezone</w:t>
-      </w:r>
-      <w:proofErr w:type="spellEnd"/>
-      <w:r>
-        <w:rPr>
-          <w:rFonts w:ascii="Arial" w:hAnsi="Arial" w:cs="Arial"/>
-          <w:sz w:val="20"/>
-          <w:szCs w:val="20"/>
-        </w:rPr>
-        <w:t xml:space="preserve"> of the drone is not as expected? </w:t>
-      </w:r>
-      <w:r>
-        <w:rPr>
-          <w:rFonts w:ascii="Arial" w:hAnsi="Arial" w:cs="Arial"/>
-          <w:sz w:val="20"/>
-          <w:szCs w:val="20"/>
-        </w:rPr>
-        <w:t xml:space="preserve">Apparently </w:t>
-      </w:r>
-      <w:proofErr w:type="spellStart"/>
-      <w:r>
-        <w:rPr>
-          <w:rFonts w:ascii="Arial" w:hAnsi="Arial" w:cs="Arial"/>
-          <w:sz w:val="20"/>
-          <w:szCs w:val="20"/>
-        </w:rPr>
-        <w:t>POSIXct</w:t>
-      </w:r>
-      <w:proofErr w:type="spellEnd"/>
-      <w:r>
-        <w:rPr>
-          <w:rFonts w:ascii="Arial" w:hAnsi="Arial" w:cs="Arial"/>
-          <w:sz w:val="20"/>
-          <w:szCs w:val="20"/>
-        </w:rPr>
-        <w:t xml:space="preserve"> coped with daylight savings automatically but one can never be too sure.</w:t>
+        <w:t xml:space="preserve">it is just some random section of the data… HUH. There has to be some kind of time-zone issue. Maybe the timezone of the drone is not as expected? </w:t>
+      </w:r>
+      <w:r>
+        <w:rPr>
+          <w:rFonts w:ascii="Arial" w:hAnsi="Arial" w:cs="Arial"/>
+          <w:sz w:val="20"/>
+          <w:szCs w:val="20"/>
+        </w:rPr>
+        <w:t>Apparently POSIXct coped with daylight savings automatically but one can never be too sure.</w:t>
       </w:r>
       <w:r>
         <w:rPr>
@@ -1256,23 +1113,7 @@
           <w:sz w:val="20"/>
           <w:szCs w:val="20"/>
         </w:rPr>
-        <w:t xml:space="preserve"> (</w:t>
-      </w:r>
-      <w:r>
-        <w:rPr>
-          <w:rFonts w:ascii="Arial" w:hAnsi="Arial" w:cs="Arial"/>
-          <w:sz w:val="20"/>
-          <w:szCs w:val="20"/>
-        </w:rPr>
-        <w:t>AEST</w:t>
-      </w:r>
-      <w:r>
-        <w:rPr>
-          <w:rFonts w:ascii="Arial" w:hAnsi="Arial" w:cs="Arial"/>
-          <w:sz w:val="20"/>
-          <w:szCs w:val="20"/>
-        </w:rPr>
-        <w:t>)</w:t>
+        <w:t xml:space="preserve"> (AEST)</w:t>
       </w:r>
       <w:r>
         <w:rPr>
@@ -1335,23 +1176,7 @@
           <w:sz w:val="20"/>
           <w:szCs w:val="20"/>
         </w:rPr>
-        <w:t xml:space="preserve"> (</w:t>
-      </w:r>
-      <w:r>
-        <w:rPr>
-          <w:rFonts w:ascii="Arial" w:hAnsi="Arial" w:cs="Arial"/>
-          <w:sz w:val="20"/>
-          <w:szCs w:val="20"/>
-        </w:rPr>
-        <w:t>AEDT</w:t>
-      </w:r>
-      <w:r>
-        <w:rPr>
-          <w:rFonts w:ascii="Arial" w:hAnsi="Arial" w:cs="Arial"/>
-          <w:sz w:val="20"/>
-          <w:szCs w:val="20"/>
-        </w:rPr>
-        <w:t>)</w:t>
+        <w:t xml:space="preserve"> (AEDT)</w:t>
       </w:r>
       <w:r>
         <w:rPr>
@@ -1460,6 +1285,10 @@
     <w:p>
       <w:pPr>
         <w:pStyle w:val="NormalWeb"/>
+        <w:numPr>
+          <w:ilvl w:val="0"/>
+          <w:numId w:val="8"/>
+        </w:numPr>
         <w:spacing w:before="0" w:beforeAutospacing="0"/>
         <w:rPr>
           <w:rFonts w:ascii="Arial" w:hAnsi="Arial" w:cs="Arial"/>
@@ -1467,6 +1296,49 @@
           <w:szCs w:val="20"/>
         </w:rPr>
       </w:pPr>
+      <w:r>
+        <w:rPr>
+          <w:rFonts w:ascii="Arial" w:hAnsi="Arial" w:cs="Arial"/>
+          <w:sz w:val="20"/>
+          <w:szCs w:val="20"/>
+        </w:rPr>
+        <w:t xml:space="preserve">While explaining this problem to Chris Clemente I realized that the issue might not actually be the timestamps of the drone but rather that the timestamps in the accel data are incorrect. (i.e., the problem I “dealt with” yesterday was actually insufficient. When showing him how the time-repeats worked, he explained how the boards worked on a hardware level and I realized that the </w:t>
+      </w:r>
+      <w:r>
+        <w:rPr>
+          <w:rFonts w:ascii="Arial" w:hAnsi="Arial" w:cs="Arial"/>
+          <w:sz w:val="20"/>
+          <w:szCs w:val="20"/>
+        </w:rPr>
+        <w:lastRenderedPageBreak/>
+        <w:t>issue was more significant than I had initially assumed. Therefore, we will be bringing Chris Bird (brilliant electrical engineer who built the boards in the first place) on to the project and get his help… Now creating debug reports from each of the kangaroos to give Chris tomorrow.</w:t>
+      </w:r>
+    </w:p>
+    <w:p>
+      <w:pPr>
+        <w:pStyle w:val="Heading3"/>
+        <w:rPr>
+          <w:rFonts w:ascii="Arial" w:hAnsi="Arial" w:cs="Arial"/>
+        </w:rPr>
+      </w:pPr>
+      <w:r>
+        <w:rPr>
+          <w:rFonts w:ascii="Arial" w:hAnsi="Arial" w:cs="Arial"/>
+        </w:rPr>
+        <w:t>1</w:t>
+      </w:r>
+      <w:r>
+        <w:rPr>
+          <w:rFonts w:ascii="Arial" w:hAnsi="Arial" w:cs="Arial"/>
+        </w:rPr>
+        <w:t>2</w:t>
+      </w:r>
+      <w:r>
+        <w:rPr>
+          <w:rFonts w:ascii="Arial" w:hAnsi="Arial" w:cs="Arial"/>
+        </w:rPr>
+        <w:t>/03</w:t>
+      </w:r>
     </w:p>
     <w:p>
       <w:pPr>
@@ -1488,9 +1360,52 @@
           <w:sz w:val="20"/>
           <w:szCs w:val="20"/>
         </w:rPr>
-        <w:lastRenderedPageBreak/>
-        <w:t>I’m realizing that the internal timestamp being wrong is probably the issue</w:t>
-      </w:r>
+        <w:t>Lola had no successful GPS hits and therefore we don’t have a matched time stamp. However, Chris B says we might be able to turn the garbled config statements back into information… This sounds really hard. Adding it to the #DOLATER list.</w:t>
+      </w:r>
+    </w:p>
+    <w:p>
+      <w:pPr>
+        <w:pStyle w:val="NormalWeb"/>
+        <w:spacing w:before="0" w:beforeAutospacing="0"/>
+        <w:rPr>
+          <w:rFonts w:ascii="Arial" w:hAnsi="Arial" w:cs="Arial"/>
+          <w:sz w:val="20"/>
+          <w:szCs w:val="20"/>
+        </w:rPr>
+      </w:pPr>
+    </w:p>
+    <w:p>
+      <w:pPr>
+        <w:pStyle w:val="NormalWeb"/>
+        <w:spacing w:before="0" w:beforeAutospacing="0"/>
+        <w:rPr>
+          <w:rFonts w:ascii="Arial" w:hAnsi="Arial" w:cs="Arial"/>
+          <w:sz w:val="20"/>
+          <w:szCs w:val="20"/>
+        </w:rPr>
+      </w:pPr>
+    </w:p>
+    <w:p>
+      <w:pPr>
+        <w:pStyle w:val="NormalWeb"/>
+        <w:spacing w:before="0" w:beforeAutospacing="0"/>
+        <w:rPr>
+          <w:rFonts w:ascii="Arial" w:hAnsi="Arial" w:cs="Arial"/>
+          <w:sz w:val="20"/>
+          <w:szCs w:val="20"/>
+        </w:rPr>
+      </w:pPr>
+    </w:p>
+    <w:p>
+      <w:pPr>
+        <w:pStyle w:val="NormalWeb"/>
+        <w:spacing w:before="0" w:beforeAutospacing="0"/>
+        <w:rPr>
+          <w:rFonts w:ascii="Arial" w:hAnsi="Arial" w:cs="Arial"/>
+          <w:sz w:val="20"/>
+          <w:szCs w:val="20"/>
+        </w:rPr>
+      </w:pPr>
     </w:p>
     <w:p>
       <w:pPr>
@@ -1512,43 +1427,30 @@
           <w:sz w:val="20"/>
           <w:szCs w:val="20"/>
         </w:rPr>
-        <w:t xml:space="preserve">Need to check whether the </w:t>
-      </w:r>
-      <w:proofErr w:type="spellStart"/>
-      <w:r>
-        <w:rPr>
-          <w:rFonts w:ascii="Arial" w:hAnsi="Arial" w:cs="Arial"/>
-          <w:sz w:val="20"/>
-          <w:szCs w:val="20"/>
-        </w:rPr>
-        <w:t>acceleromeyer</w:t>
-      </w:r>
-      <w:proofErr w:type="spellEnd"/>
-      <w:r>
-        <w:rPr>
-          <w:rFonts w:ascii="Arial" w:hAnsi="Arial" w:cs="Arial"/>
-          <w:sz w:val="20"/>
-          <w:szCs w:val="20"/>
-        </w:rPr>
-        <w:t xml:space="preserve"> also shows the problem, then it must be a board fault. If the accelerometer is normal, then it’s an issue with the serial communication between the board and the </w:t>
-      </w:r>
-      <w:proofErr w:type="spellStart"/>
-      <w:r>
-        <w:rPr>
-          <w:rFonts w:ascii="Arial" w:hAnsi="Arial" w:cs="Arial"/>
-          <w:sz w:val="20"/>
-          <w:szCs w:val="20"/>
-        </w:rPr>
-        <w:t>gos</w:t>
-      </w:r>
-      <w:proofErr w:type="spellEnd"/>
-      <w:r>
-        <w:rPr>
-          <w:rFonts w:ascii="Arial" w:hAnsi="Arial" w:cs="Arial"/>
-          <w:sz w:val="20"/>
-          <w:szCs w:val="20"/>
-        </w:rPr>
-        <w:t xml:space="preserve"> </w:t>
+        <w:t>I’m realizing that the internal timestamp being wrong is probably the issue</w:t>
+      </w:r>
+    </w:p>
+    <w:p>
+      <w:pPr>
+        <w:pStyle w:val="NormalWeb"/>
+        <w:numPr>
+          <w:ilvl w:val="0"/>
+          <w:numId w:val="8"/>
+        </w:numPr>
+        <w:spacing w:before="0" w:beforeAutospacing="0"/>
+        <w:rPr>
+          <w:rFonts w:ascii="Arial" w:hAnsi="Arial" w:cs="Arial"/>
+          <w:sz w:val="20"/>
+          <w:szCs w:val="20"/>
+        </w:rPr>
+      </w:pPr>
+      <w:r>
+        <w:rPr>
+          <w:rFonts w:ascii="Arial" w:hAnsi="Arial" w:cs="Arial"/>
+          <w:sz w:val="20"/>
+          <w:szCs w:val="20"/>
+        </w:rPr>
+        <w:t xml:space="preserve">Need to check whether the acceleromeyer also shows the problem, then it must be a board fault. If the accelerometer is normal, then it’s an issue with the serial communication between the board and the gos </w:t>
       </w:r>
     </w:p>
     <w:p>
@@ -3165,6 +3067,7 @@
   <w:style w:type="character" w:default="1" w:styleId="DefaultParagraphFont">
     <w:name w:val="Default Paragraph Font"/>
     <w:uiPriority w:val="1"/>
+    <w:semiHidden/>
     <w:unhideWhenUsed/>
   </w:style>
   <w:style w:type="table" w:default="1" w:styleId="TableNormal">

</xml_diff>

<commit_message>
correcting the gps error using line of best fit
</commit_message>
<xml_diff>
--- a/Notes/Worklog.docx
+++ b/Notes/Worklog.docx
@@ -104,7 +104,25 @@
           <w:sz w:val="20"/>
           <w:szCs w:val="20"/>
         </w:rPr>
-        <w:t>Found that the devices had turned on and off as much as 26 times during the deployment. It seems that most of these are maybe the death-throws of the battery. In the big Cahuna data, there was 11 straight days and then 23 times of being turned on for a few seconds. Decided to delete any events that were less than 1 hour (because we couldn't get any meaningful data out of them anyway, really).</w:t>
+        <w:t xml:space="preserve">Found that the devices had turned on and off as much as 26 times during the deployment. It seems that most of these are maybe the death-throws of the battery. In the big </w:t>
+      </w:r>
+      <w:proofErr w:type="spellStart"/>
+      <w:r>
+        <w:rPr>
+          <w:rFonts w:ascii="Arial" w:hAnsi="Arial" w:cs="Arial"/>
+          <w:sz w:val="20"/>
+          <w:szCs w:val="20"/>
+        </w:rPr>
+        <w:t>Cahuna</w:t>
+      </w:r>
+      <w:proofErr w:type="spellEnd"/>
+      <w:r>
+        <w:rPr>
+          <w:rFonts w:ascii="Arial" w:hAnsi="Arial" w:cs="Arial"/>
+          <w:sz w:val="20"/>
+          <w:szCs w:val="20"/>
+        </w:rPr>
+        <w:t xml:space="preserve"> data, there was 11 straight days and then 23 times of being turned on for a few seconds. Decided to delete any events that were less than 1 hour (because we couldn't get any meaningful data out of them anyway, really).</w:t>
       </w:r>
       <w:r>
         <w:rPr>
@@ -198,7 +216,43 @@
           <w:sz w:val="20"/>
           <w:szCs w:val="20"/>
         </w:rPr>
-        <w:t>. Exploring the gps_data directly but found that sometimes the internal clock had tweaked and shown only a few seconds elapsed when the gps_timestamp showed that really a lot of time elapsed.</w:t>
+        <w:t xml:space="preserve">. Exploring the </w:t>
+      </w:r>
+      <w:proofErr w:type="spellStart"/>
+      <w:r>
+        <w:rPr>
+          <w:rFonts w:ascii="Arial" w:hAnsi="Arial" w:cs="Arial"/>
+          <w:sz w:val="20"/>
+          <w:szCs w:val="20"/>
+        </w:rPr>
+        <w:t>gps_data</w:t>
+      </w:r>
+      <w:proofErr w:type="spellEnd"/>
+      <w:r>
+        <w:rPr>
+          <w:rFonts w:ascii="Arial" w:hAnsi="Arial" w:cs="Arial"/>
+          <w:sz w:val="20"/>
+          <w:szCs w:val="20"/>
+        </w:rPr>
+        <w:t xml:space="preserve"> directly but found that sometimes the internal clock had tweaked and shown only a few seconds elapsed when the </w:t>
+      </w:r>
+      <w:proofErr w:type="spellStart"/>
+      <w:r>
+        <w:rPr>
+          <w:rFonts w:ascii="Arial" w:hAnsi="Arial" w:cs="Arial"/>
+          <w:sz w:val="20"/>
+          <w:szCs w:val="20"/>
+        </w:rPr>
+        <w:t>gps_timestamp</w:t>
+      </w:r>
+      <w:proofErr w:type="spellEnd"/>
+      <w:r>
+        <w:rPr>
+          <w:rFonts w:ascii="Arial" w:hAnsi="Arial" w:cs="Arial"/>
+          <w:sz w:val="20"/>
+          <w:szCs w:val="20"/>
+        </w:rPr>
+        <w:t xml:space="preserve"> showed that really a lot of time elapsed.</w:t>
       </w:r>
       <w:r>
         <w:rPr>
@@ -278,7 +332,25 @@
           <w:sz w:val="20"/>
           <w:szCs w:val="20"/>
         </w:rPr>
-        <w:t>This could easily have happened if there was corruption in the artemis writing to file (there’s a lot of corruption). Let’s go check the relevant file…</w:t>
+        <w:t xml:space="preserve">This could easily have happened if there was corruption in the </w:t>
+      </w:r>
+      <w:proofErr w:type="spellStart"/>
+      <w:r>
+        <w:rPr>
+          <w:rFonts w:ascii="Arial" w:hAnsi="Arial" w:cs="Arial"/>
+          <w:sz w:val="20"/>
+          <w:szCs w:val="20"/>
+        </w:rPr>
+        <w:t>artemis</w:t>
+      </w:r>
+      <w:proofErr w:type="spellEnd"/>
+      <w:r>
+        <w:rPr>
+          <w:rFonts w:ascii="Arial" w:hAnsi="Arial" w:cs="Arial"/>
+          <w:sz w:val="20"/>
+          <w:szCs w:val="20"/>
+        </w:rPr>
+        <w:t xml:space="preserve"> writing to file (there’s a lot of corruption). Let’s go check the relevant file…</w:t>
       </w:r>
     </w:p>
     <w:p>
@@ -647,16 +719,44 @@
           <w:sz w:val="20"/>
           <w:szCs w:val="20"/>
         </w:rPr>
-        <w:t xml:space="preserve">change the internal timestamp so it’s a relative change between the gps_timestamps. </w:t>
-      </w:r>
-      <w:r>
-        <w:rPr>
-          <w:rFonts w:ascii="Arial" w:hAnsi="Arial" w:cs="Arial"/>
-          <w:sz w:val="20"/>
-          <w:szCs w:val="20"/>
-        </w:rPr>
-        <w:t>Because I don’t want to affect the other timestamps, I will just re-interpolate when the reads occur on the same internal_timestamp</w:t>
-      </w:r>
+        <w:t xml:space="preserve">change the internal timestamp so it’s a relative change between the </w:t>
+      </w:r>
+      <w:proofErr w:type="spellStart"/>
+      <w:r>
+        <w:rPr>
+          <w:rFonts w:ascii="Arial" w:hAnsi="Arial" w:cs="Arial"/>
+          <w:sz w:val="20"/>
+          <w:szCs w:val="20"/>
+        </w:rPr>
+        <w:t>gps_timestamps</w:t>
+      </w:r>
+      <w:proofErr w:type="spellEnd"/>
+      <w:r>
+        <w:rPr>
+          <w:rFonts w:ascii="Arial" w:hAnsi="Arial" w:cs="Arial"/>
+          <w:sz w:val="20"/>
+          <w:szCs w:val="20"/>
+        </w:rPr>
+        <w:t xml:space="preserve">. </w:t>
+      </w:r>
+      <w:r>
+        <w:rPr>
+          <w:rFonts w:ascii="Arial" w:hAnsi="Arial" w:cs="Arial"/>
+          <w:sz w:val="20"/>
+          <w:szCs w:val="20"/>
+        </w:rPr>
+        <w:t xml:space="preserve">Because I don’t want to affect the other timestamps, I will just re-interpolate when the reads occur on the same </w:t>
+      </w:r>
+      <w:proofErr w:type="spellStart"/>
+      <w:r>
+        <w:rPr>
+          <w:rFonts w:ascii="Arial" w:hAnsi="Arial" w:cs="Arial"/>
+          <w:sz w:val="20"/>
+          <w:szCs w:val="20"/>
+        </w:rPr>
+        <w:t>internal_timestamp</w:t>
+      </w:r>
+      <w:proofErr w:type="spellEnd"/>
       <w:r>
         <w:rPr>
           <w:rFonts w:ascii="Arial" w:hAnsi="Arial" w:cs="Arial"/>
@@ -791,7 +891,25 @@
           <w:sz w:val="20"/>
           <w:szCs w:val="20"/>
         </w:rPr>
-        <w:t>My guess is that something has come in as AEST time rather than UTC, or has been converted somewhere. Will go back through carefully</w:t>
+        <w:t xml:space="preserve">My guess is that something has come in as AEST time rather than </w:t>
+      </w:r>
+      <w:proofErr w:type="gramStart"/>
+      <w:r>
+        <w:rPr>
+          <w:rFonts w:ascii="Arial" w:hAnsi="Arial" w:cs="Arial"/>
+          <w:sz w:val="20"/>
+          <w:szCs w:val="20"/>
+        </w:rPr>
+        <w:t>UTC, or</w:t>
+      </w:r>
+      <w:proofErr w:type="gramEnd"/>
+      <w:r>
+        <w:rPr>
+          <w:rFonts w:ascii="Arial" w:hAnsi="Arial" w:cs="Arial"/>
+          <w:sz w:val="20"/>
+          <w:szCs w:val="20"/>
+        </w:rPr>
+        <w:t xml:space="preserve"> has been converted somewhere. Will go back through carefully</w:t>
       </w:r>
       <w:r>
         <w:rPr>
@@ -1058,15 +1176,69 @@
           <w:sz w:val="20"/>
           <w:szCs w:val="20"/>
         </w:rPr>
-        <w:t xml:space="preserve">it is just some random section of the data… HUH. There has to be some kind of time-zone issue. Maybe the timezone of the drone is not as expected? </w:t>
-      </w:r>
-      <w:r>
-        <w:rPr>
-          <w:rFonts w:ascii="Arial" w:hAnsi="Arial" w:cs="Arial"/>
-          <w:sz w:val="20"/>
-          <w:szCs w:val="20"/>
-        </w:rPr>
-        <w:t>Apparently POSIXct coped with daylight savings automatically but one can never be too sure.</w:t>
+        <w:t xml:space="preserve">it is just some random section of the data… HUH. There </w:t>
+      </w:r>
+      <w:proofErr w:type="gramStart"/>
+      <w:r>
+        <w:rPr>
+          <w:rFonts w:ascii="Arial" w:hAnsi="Arial" w:cs="Arial"/>
+          <w:sz w:val="20"/>
+          <w:szCs w:val="20"/>
+        </w:rPr>
+        <w:t>has to</w:t>
+      </w:r>
+      <w:proofErr w:type="gramEnd"/>
+      <w:r>
+        <w:rPr>
+          <w:rFonts w:ascii="Arial" w:hAnsi="Arial" w:cs="Arial"/>
+          <w:sz w:val="20"/>
+          <w:szCs w:val="20"/>
+        </w:rPr>
+        <w:t xml:space="preserve"> be some kind of time-zone issue. Maybe the </w:t>
+      </w:r>
+      <w:proofErr w:type="spellStart"/>
+      <w:r>
+        <w:rPr>
+          <w:rFonts w:ascii="Arial" w:hAnsi="Arial" w:cs="Arial"/>
+          <w:sz w:val="20"/>
+          <w:szCs w:val="20"/>
+        </w:rPr>
+        <w:t>timezone</w:t>
+      </w:r>
+      <w:proofErr w:type="spellEnd"/>
+      <w:r>
+        <w:rPr>
+          <w:rFonts w:ascii="Arial" w:hAnsi="Arial" w:cs="Arial"/>
+          <w:sz w:val="20"/>
+          <w:szCs w:val="20"/>
+        </w:rPr>
+        <w:t xml:space="preserve"> of the drone is not as expected? </w:t>
+      </w:r>
+      <w:r>
+        <w:rPr>
+          <w:rFonts w:ascii="Arial" w:hAnsi="Arial" w:cs="Arial"/>
+          <w:sz w:val="20"/>
+          <w:szCs w:val="20"/>
+        </w:rPr>
+        <w:t xml:space="preserve">Apparently </w:t>
+      </w:r>
+      <w:proofErr w:type="spellStart"/>
+      <w:r>
+        <w:rPr>
+          <w:rFonts w:ascii="Arial" w:hAnsi="Arial" w:cs="Arial"/>
+          <w:sz w:val="20"/>
+          <w:szCs w:val="20"/>
+        </w:rPr>
+        <w:t>POSIXct</w:t>
+      </w:r>
+      <w:proofErr w:type="spellEnd"/>
+      <w:r>
+        <w:rPr>
+          <w:rFonts w:ascii="Arial" w:hAnsi="Arial" w:cs="Arial"/>
+          <w:sz w:val="20"/>
+          <w:szCs w:val="20"/>
+        </w:rPr>
+        <w:t xml:space="preserve"> coped with daylight savings automatically but one can never be too sure.</w:t>
       </w:r>
       <w:r>
         <w:rPr>
@@ -1200,8 +1372,18 @@
           <w:sz w:val="20"/>
           <w:szCs w:val="20"/>
         </w:rPr>
-        <w:t xml:space="preserve"> apparently this is already taken into account</w:t>
-      </w:r>
+        <w:t xml:space="preserve"> apparently this is already </w:t>
+      </w:r>
+      <w:proofErr w:type="gramStart"/>
+      <w:r>
+        <w:rPr>
+          <w:rFonts w:ascii="Arial" w:hAnsi="Arial" w:cs="Arial"/>
+          <w:sz w:val="20"/>
+          <w:szCs w:val="20"/>
+        </w:rPr>
+        <w:t>taken into account</w:t>
+      </w:r>
+      <w:proofErr w:type="gramEnd"/>
     </w:p>
     <w:p>
       <w:pPr>
@@ -1302,7 +1484,25 @@
           <w:sz w:val="20"/>
           <w:szCs w:val="20"/>
         </w:rPr>
-        <w:t xml:space="preserve">While explaining this problem to Chris Clemente I realized that the issue might not actually be the timestamps of the drone but rather that the timestamps in the accel data are incorrect. (i.e., the problem I “dealt with” yesterday was actually insufficient. When showing him how the time-repeats worked, he explained how the boards worked on a hardware level and I realized that the </w:t>
+        <w:t xml:space="preserve">While explaining this problem to Chris Clemente I realized that the issue might not actually be the timestamps of the drone but rather that the timestamps in the accel data are incorrect. (i.e., the problem I “dealt with” yesterday was </w:t>
+      </w:r>
+      <w:proofErr w:type="gramStart"/>
+      <w:r>
+        <w:rPr>
+          <w:rFonts w:ascii="Arial" w:hAnsi="Arial" w:cs="Arial"/>
+          <w:sz w:val="20"/>
+          <w:szCs w:val="20"/>
+        </w:rPr>
+        <w:t>actually insufficient</w:t>
+      </w:r>
+      <w:proofErr w:type="gramEnd"/>
+      <w:r>
+        <w:rPr>
+          <w:rFonts w:ascii="Arial" w:hAnsi="Arial" w:cs="Arial"/>
+          <w:sz w:val="20"/>
+          <w:szCs w:val="20"/>
+        </w:rPr>
+        <w:t xml:space="preserve">. When showing him how the time-repeats worked, he explained how the boards worked on a hardware level and I realized that the </w:t>
       </w:r>
       <w:r>
         <w:rPr>
@@ -1311,7 +1511,25 @@
           <w:szCs w:val="20"/>
         </w:rPr>
         <w:lastRenderedPageBreak/>
-        <w:t>issue was more significant than I had initially assumed. Therefore, we will be bringing Chris Bird (brilliant electrical engineer who built the boards in the first place) on to the project and get his help… Now creating debug reports from each of the kangaroos to give Chris tomorrow.</w:t>
+        <w:t xml:space="preserve">issue was more significant than I had initially assumed. Therefore, we will be bringing Chris Bird (brilliant electrical engineer who built the boards in the first place) on to the project and get his help… Now </w:t>
+      </w:r>
+      <w:proofErr w:type="gramStart"/>
+      <w:r>
+        <w:rPr>
+          <w:rFonts w:ascii="Arial" w:hAnsi="Arial" w:cs="Arial"/>
+          <w:sz w:val="20"/>
+          <w:szCs w:val="20"/>
+        </w:rPr>
+        <w:t>creating</w:t>
+      </w:r>
+      <w:proofErr w:type="gramEnd"/>
+      <w:r>
+        <w:rPr>
+          <w:rFonts w:ascii="Arial" w:hAnsi="Arial" w:cs="Arial"/>
+          <w:sz w:val="20"/>
+          <w:szCs w:val="20"/>
+        </w:rPr>
+        <w:t xml:space="preserve"> debug reports from each of the kangaroos to give Chris tomorrow.</w:t>
       </w:r>
     </w:p>
     <w:p>
@@ -1360,52 +1578,26 @@
           <w:sz w:val="20"/>
           <w:szCs w:val="20"/>
         </w:rPr>
-        <w:t>Lola had no successful GPS hits and therefore we don’t have a matched time stamp. However, Chris B says we might be able to turn the garbled config statements back into information… This sounds really hard. Adding it to the #DOLATER list.</w:t>
-      </w:r>
-    </w:p>
-    <w:p>
-      <w:pPr>
-        <w:pStyle w:val="NormalWeb"/>
-        <w:spacing w:before="0" w:beforeAutospacing="0"/>
-        <w:rPr>
-          <w:rFonts w:ascii="Arial" w:hAnsi="Arial" w:cs="Arial"/>
-          <w:sz w:val="20"/>
-          <w:szCs w:val="20"/>
-        </w:rPr>
-      </w:pPr>
-    </w:p>
-    <w:p>
-      <w:pPr>
-        <w:pStyle w:val="NormalWeb"/>
-        <w:spacing w:before="0" w:beforeAutospacing="0"/>
-        <w:rPr>
-          <w:rFonts w:ascii="Arial" w:hAnsi="Arial" w:cs="Arial"/>
-          <w:sz w:val="20"/>
-          <w:szCs w:val="20"/>
-        </w:rPr>
-      </w:pPr>
-    </w:p>
-    <w:p>
-      <w:pPr>
-        <w:pStyle w:val="NormalWeb"/>
-        <w:spacing w:before="0" w:beforeAutospacing="0"/>
-        <w:rPr>
-          <w:rFonts w:ascii="Arial" w:hAnsi="Arial" w:cs="Arial"/>
-          <w:sz w:val="20"/>
-          <w:szCs w:val="20"/>
-        </w:rPr>
-      </w:pPr>
-    </w:p>
-    <w:p>
-      <w:pPr>
-        <w:pStyle w:val="NormalWeb"/>
-        <w:spacing w:before="0" w:beforeAutospacing="0"/>
-        <w:rPr>
-          <w:rFonts w:ascii="Arial" w:hAnsi="Arial" w:cs="Arial"/>
-          <w:sz w:val="20"/>
-          <w:szCs w:val="20"/>
-        </w:rPr>
-      </w:pPr>
+        <w:t xml:space="preserve">Lola had no successful GPS hits and therefore we don’t have a matched time stamp. However, Chris B says we might be able to turn the garbled config statements back into information… This sounds </w:t>
+      </w:r>
+      <w:proofErr w:type="gramStart"/>
+      <w:r>
+        <w:rPr>
+          <w:rFonts w:ascii="Arial" w:hAnsi="Arial" w:cs="Arial"/>
+          <w:sz w:val="20"/>
+          <w:szCs w:val="20"/>
+        </w:rPr>
+        <w:t>really hard</w:t>
+      </w:r>
+      <w:proofErr w:type="gramEnd"/>
+      <w:r>
+        <w:rPr>
+          <w:rFonts w:ascii="Arial" w:hAnsi="Arial" w:cs="Arial"/>
+          <w:sz w:val="20"/>
+          <w:szCs w:val="20"/>
+        </w:rPr>
+        <w:t>. Adding it to the #DOLATER list.</w:t>
+      </w:r>
     </w:p>
     <w:p>
       <w:pPr>
@@ -1427,7 +1619,277 @@
           <w:sz w:val="20"/>
           <w:szCs w:val="20"/>
         </w:rPr>
-        <w:t>I’m realizing that the internal timestamp being wrong is probably the issue</w:t>
+        <w:t xml:space="preserve">Otherwise spent a bit of time debugging with </w:t>
+      </w:r>
+      <w:proofErr w:type="spellStart"/>
+      <w:r>
+        <w:rPr>
+          <w:rFonts w:ascii="Arial" w:hAnsi="Arial" w:cs="Arial"/>
+          <w:sz w:val="20"/>
+          <w:szCs w:val="20"/>
+        </w:rPr>
+        <w:t>ChrisB</w:t>
+      </w:r>
+      <w:proofErr w:type="spellEnd"/>
+      <w:r>
+        <w:rPr>
+          <w:rFonts w:ascii="Arial" w:hAnsi="Arial" w:cs="Arial"/>
+          <w:sz w:val="20"/>
+          <w:szCs w:val="20"/>
+        </w:rPr>
+        <w:t xml:space="preserve">, sending him segments of data and he checked them in </w:t>
+      </w:r>
+      <w:proofErr w:type="spellStart"/>
+      <w:r>
+        <w:rPr>
+          <w:rFonts w:ascii="Arial" w:hAnsi="Arial" w:cs="Arial"/>
+          <w:sz w:val="20"/>
+          <w:szCs w:val="20"/>
+        </w:rPr>
+        <w:t>matlab</w:t>
+      </w:r>
+      <w:proofErr w:type="spellEnd"/>
+      <w:r>
+        <w:rPr>
+          <w:rFonts w:ascii="Arial" w:hAnsi="Arial" w:cs="Arial"/>
+          <w:sz w:val="20"/>
+          <w:szCs w:val="20"/>
+        </w:rPr>
+        <w:t xml:space="preserve">. A conclusion </w:t>
+      </w:r>
+      <w:proofErr w:type="gramStart"/>
+      <w:r>
+        <w:rPr>
+          <w:rFonts w:ascii="Arial" w:hAnsi="Arial" w:cs="Arial"/>
+          <w:sz w:val="20"/>
+          <w:szCs w:val="20"/>
+        </w:rPr>
+        <w:t>of</w:t>
+      </w:r>
+      <w:proofErr w:type="gramEnd"/>
+      <w:r>
+        <w:rPr>
+          <w:rFonts w:ascii="Arial" w:hAnsi="Arial" w:cs="Arial"/>
+          <w:sz w:val="20"/>
+          <w:szCs w:val="20"/>
+        </w:rPr>
+        <w:t xml:space="preserve"> what </w:t>
+      </w:r>
+      <w:r>
+        <w:rPr>
+          <w:rFonts w:ascii="Arial" w:hAnsi="Arial" w:cs="Arial"/>
+          <w:sz w:val="20"/>
+          <w:szCs w:val="20"/>
+        </w:rPr>
+        <w:t>was decided</w:t>
+      </w:r>
+      <w:r>
+        <w:rPr>
+          <w:rFonts w:ascii="Arial" w:hAnsi="Arial" w:cs="Arial"/>
+          <w:sz w:val="20"/>
+          <w:szCs w:val="20"/>
+        </w:rPr>
+        <w:t>:</w:t>
+      </w:r>
+    </w:p>
+    <w:p>
+      <w:pPr>
+        <w:pStyle w:val="NormalWeb"/>
+        <w:numPr>
+          <w:ilvl w:val="1"/>
+          <w:numId w:val="8"/>
+        </w:numPr>
+        <w:spacing w:before="0" w:beforeAutospacing="0"/>
+        <w:rPr>
+          <w:rFonts w:ascii="Arial" w:hAnsi="Arial" w:cs="Arial"/>
+          <w:sz w:val="20"/>
+          <w:szCs w:val="20"/>
+        </w:rPr>
+      </w:pPr>
+      <w:r>
+        <w:rPr>
+          <w:rFonts w:ascii="Arial" w:hAnsi="Arial" w:cs="Arial"/>
+          <w:sz w:val="20"/>
+          <w:szCs w:val="20"/>
+        </w:rPr>
+        <w:t xml:space="preserve">Every now and then the internal clock on the GPS does not </w:t>
+      </w:r>
+      <w:proofErr w:type="gramStart"/>
+      <w:r>
+        <w:rPr>
+          <w:rFonts w:ascii="Arial" w:hAnsi="Arial" w:cs="Arial"/>
+          <w:sz w:val="20"/>
+          <w:szCs w:val="20"/>
+        </w:rPr>
+        <w:t>increment</w:t>
+      </w:r>
+      <w:proofErr w:type="gramEnd"/>
+      <w:r>
+        <w:rPr>
+          <w:rFonts w:ascii="Arial" w:hAnsi="Arial" w:cs="Arial"/>
+          <w:sz w:val="20"/>
+          <w:szCs w:val="20"/>
+        </w:rPr>
+        <w:t xml:space="preserve"> the same as the external clock. To account for this we can find the </w:t>
+      </w:r>
+      <w:proofErr w:type="gramStart"/>
+      <w:r>
+        <w:rPr>
+          <w:rFonts w:ascii="Arial" w:hAnsi="Arial" w:cs="Arial"/>
+          <w:sz w:val="20"/>
+          <w:szCs w:val="20"/>
+        </w:rPr>
+        <w:t>line of best fit</w:t>
+      </w:r>
+      <w:proofErr w:type="gramEnd"/>
+      <w:r>
+        <w:rPr>
+          <w:rFonts w:ascii="Arial" w:hAnsi="Arial" w:cs="Arial"/>
+          <w:sz w:val="20"/>
+          <w:szCs w:val="20"/>
+        </w:rPr>
+        <w:t xml:space="preserve"> between the internal and external</w:t>
+      </w:r>
+      <w:r>
+        <w:rPr>
+          <w:rFonts w:ascii="Arial" w:hAnsi="Arial" w:cs="Arial"/>
+          <w:sz w:val="20"/>
+          <w:szCs w:val="20"/>
+        </w:rPr>
+        <w:t xml:space="preserve"> (ensuring the first from each line up exactly</w:t>
+      </w:r>
+      <w:r>
+        <w:rPr>
+          <w:rFonts w:ascii="Arial" w:hAnsi="Arial" w:cs="Arial"/>
+          <w:sz w:val="20"/>
+          <w:szCs w:val="20"/>
+        </w:rPr>
+        <w:t xml:space="preserve"> and there is a 0 intercept</w:t>
+      </w:r>
+      <w:proofErr w:type="gramStart"/>
+      <w:r>
+        <w:rPr>
+          <w:rFonts w:ascii="Arial" w:hAnsi="Arial" w:cs="Arial"/>
+          <w:sz w:val="20"/>
+          <w:szCs w:val="20"/>
+        </w:rPr>
+        <w:t>)</w:t>
+      </w:r>
+      <w:r>
+        <w:rPr>
+          <w:rFonts w:ascii="Arial" w:hAnsi="Arial" w:cs="Arial"/>
+          <w:sz w:val="20"/>
+          <w:szCs w:val="20"/>
+        </w:rPr>
+        <w:t>, and</w:t>
+      </w:r>
+      <w:proofErr w:type="gramEnd"/>
+      <w:r>
+        <w:rPr>
+          <w:rFonts w:ascii="Arial" w:hAnsi="Arial" w:cs="Arial"/>
+          <w:sz w:val="20"/>
+          <w:szCs w:val="20"/>
+        </w:rPr>
+        <w:t xml:space="preserve"> then input our </w:t>
+      </w:r>
+      <w:r>
+        <w:rPr>
+          <w:rFonts w:ascii="Arial" w:hAnsi="Arial" w:cs="Arial"/>
+          <w:sz w:val="20"/>
+          <w:szCs w:val="20"/>
+        </w:rPr>
+        <w:t>internal of the accelerometer</w:t>
+      </w:r>
+      <w:r>
+        <w:rPr>
+          <w:rFonts w:ascii="Arial" w:hAnsi="Arial" w:cs="Arial"/>
+          <w:sz w:val="20"/>
+          <w:szCs w:val="20"/>
+        </w:rPr>
+        <w:t xml:space="preserve"> into that equation to get the corrected </w:t>
+      </w:r>
+      <w:r>
+        <w:rPr>
+          <w:rFonts w:ascii="Arial" w:hAnsi="Arial" w:cs="Arial"/>
+          <w:sz w:val="20"/>
+          <w:szCs w:val="20"/>
+        </w:rPr>
+        <w:t>external</w:t>
+      </w:r>
+      <w:r>
+        <w:rPr>
+          <w:rFonts w:ascii="Arial" w:hAnsi="Arial" w:cs="Arial"/>
+          <w:sz w:val="20"/>
+          <w:szCs w:val="20"/>
+        </w:rPr>
+        <w:t>.</w:t>
+      </w:r>
+    </w:p>
+    <w:p>
+      <w:pPr>
+        <w:pStyle w:val="NormalWeb"/>
+        <w:numPr>
+          <w:ilvl w:val="1"/>
+          <w:numId w:val="8"/>
+        </w:numPr>
+        <w:spacing w:before="0" w:beforeAutospacing="0"/>
+        <w:rPr>
+          <w:rFonts w:ascii="Arial" w:hAnsi="Arial" w:cs="Arial"/>
+          <w:sz w:val="20"/>
+          <w:szCs w:val="20"/>
+        </w:rPr>
+      </w:pPr>
+      <w:r>
+        <w:rPr>
+          <w:rFonts w:ascii="Arial" w:hAnsi="Arial" w:cs="Arial"/>
+          <w:sz w:val="20"/>
+          <w:szCs w:val="20"/>
+        </w:rPr>
+        <w:t xml:space="preserve">For the accelerometer internal clock, bugs are rarer and less problematic as they appear to </w:t>
+      </w:r>
+      <w:proofErr w:type="gramStart"/>
+      <w:r>
+        <w:rPr>
+          <w:rFonts w:ascii="Arial" w:hAnsi="Arial" w:cs="Arial"/>
+          <w:sz w:val="20"/>
+          <w:szCs w:val="20"/>
+        </w:rPr>
+        <w:t>self</w:t>
+      </w:r>
+      <w:proofErr w:type="gramEnd"/>
+      <w:r>
+        <w:rPr>
+          <w:rFonts w:ascii="Arial" w:hAnsi="Arial" w:cs="Arial"/>
+          <w:sz w:val="20"/>
+          <w:szCs w:val="20"/>
+        </w:rPr>
+        <w:t>-correct after a few seconds anyway. However, could have a log where if the difference is &gt; or &lt; 10 sec (for example) then we manually correct them.</w:t>
+      </w:r>
+    </w:p>
+    <w:p>
+      <w:pPr>
+        <w:pStyle w:val="Heading3"/>
+        <w:rPr>
+          <w:rFonts w:ascii="Arial" w:hAnsi="Arial" w:cs="Arial"/>
+        </w:rPr>
+      </w:pPr>
+      <w:r>
+        <w:rPr>
+          <w:rFonts w:ascii="Arial" w:hAnsi="Arial" w:cs="Arial"/>
+        </w:rPr>
+        <w:t>1</w:t>
+      </w:r>
+      <w:r>
+        <w:rPr>
+          <w:rFonts w:ascii="Arial" w:hAnsi="Arial" w:cs="Arial"/>
+        </w:rPr>
+        <w:t>3</w:t>
+      </w:r>
+      <w:r>
+        <w:rPr>
+          <w:rFonts w:ascii="Arial" w:hAnsi="Arial" w:cs="Arial"/>
+        </w:rPr>
+        <w:t>/03</w:t>
       </w:r>
     </w:p>
     <w:p>
@@ -1450,18 +1912,173 @@
           <w:sz w:val="20"/>
           <w:szCs w:val="20"/>
         </w:rPr>
-        <w:t xml:space="preserve">Need to check whether the acceleromeyer also shows the problem, then it must be a board fault. If the accelerometer is normal, then it’s an issue with the serial communication between the board and the gos </w:t>
+        <w:t xml:space="preserve">After making the corrections to the </w:t>
+      </w:r>
+      <w:proofErr w:type="spellStart"/>
+      <w:r>
+        <w:rPr>
+          <w:rFonts w:ascii="Arial" w:hAnsi="Arial" w:cs="Arial"/>
+          <w:sz w:val="20"/>
+          <w:szCs w:val="20"/>
+        </w:rPr>
+        <w:t>gps</w:t>
+      </w:r>
+      <w:proofErr w:type="spellEnd"/>
+      <w:r>
+        <w:rPr>
+          <w:rFonts w:ascii="Arial" w:hAnsi="Arial" w:cs="Arial"/>
+          <w:sz w:val="20"/>
+          <w:szCs w:val="20"/>
+        </w:rPr>
+        <w:t xml:space="preserve"> (or rather, first attempt at fixing them), I tried once again to align the videos. This time I at least got a recognizable </w:t>
+      </w:r>
+      <w:proofErr w:type="spellStart"/>
+      <w:r>
+        <w:rPr>
+          <w:rFonts w:ascii="Arial" w:hAnsi="Arial" w:cs="Arial"/>
+          <w:sz w:val="20"/>
+          <w:szCs w:val="20"/>
+        </w:rPr>
+        <w:t>behaviour</w:t>
+      </w:r>
+      <w:proofErr w:type="spellEnd"/>
+      <w:r>
+        <w:rPr>
+          <w:rFonts w:ascii="Arial" w:hAnsi="Arial" w:cs="Arial"/>
+          <w:sz w:val="20"/>
+          <w:szCs w:val="20"/>
+        </w:rPr>
+        <w:t xml:space="preserve"> --- a </w:t>
+      </w:r>
+      <w:proofErr w:type="gramStart"/>
+      <w:r>
+        <w:rPr>
+          <w:rFonts w:ascii="Arial" w:hAnsi="Arial" w:cs="Arial"/>
+          <w:sz w:val="20"/>
+          <w:szCs w:val="20"/>
+        </w:rPr>
+        <w:t>hop</w:t>
+      </w:r>
+      <w:proofErr w:type="gramEnd"/>
+      <w:r>
+        <w:rPr>
+          <w:rFonts w:ascii="Arial" w:hAnsi="Arial" w:cs="Arial"/>
+          <w:sz w:val="20"/>
+          <w:szCs w:val="20"/>
+        </w:rPr>
+        <w:t>! However, in the video, hopping is followed by scratching and looking around, which I can’t see in this trace… as it appears too flat afterwards.</w:t>
       </w:r>
     </w:p>
     <w:p>
       <w:pPr>
-        <w:rPr>
-          <w:rFonts w:ascii="Arial" w:hAnsi="Arial" w:cs="Arial"/>
-        </w:rPr>
-      </w:pPr>
+        <w:pStyle w:val="NormalWeb"/>
+        <w:spacing w:before="0" w:beforeAutospacing="0"/>
+        <w:ind w:firstLine="720"/>
+        <w:jc w:val="center"/>
+        <w:rPr>
+          <w:rFonts w:ascii="Arial" w:hAnsi="Arial" w:cs="Arial"/>
+          <w:sz w:val="20"/>
+          <w:szCs w:val="20"/>
+        </w:rPr>
+      </w:pPr>
+      <w:r>
+        <w:rPr>
+          <w:rFonts w:ascii="Arial" w:hAnsi="Arial" w:cs="Arial"/>
+          <w:sz w:val="20"/>
+          <w:szCs w:val="20"/>
+        </w:rPr>
+        <w:drawing>
+          <wp:inline distT="0" distB="0" distL="0" distR="0" wp14:anchorId="0C7B459C" wp14:editId="7E2E3D4E">
+            <wp:extent cx="3636335" cy="1811175"/>
+            <wp:effectExtent l="0" t="0" r="2540" b="0"/>
+            <wp:docPr id="1995225327" name="Picture 1"/>
+            <wp:cNvGraphicFramePr>
+              <a:graphicFrameLocks xmlns:a="http://schemas.openxmlformats.org/drawingml/2006/main" noChangeAspect="1"/>
+            </wp:cNvGraphicFramePr>
+            <a:graphic xmlns:a="http://schemas.openxmlformats.org/drawingml/2006/main">
+              <a:graphicData uri="http://schemas.openxmlformats.org/drawingml/2006/picture">
+                <pic:pic xmlns:pic="http://schemas.openxmlformats.org/drawingml/2006/picture">
+                  <pic:nvPicPr>
+                    <pic:cNvPr id="1995225327" name=""/>
+                    <pic:cNvPicPr/>
+                  </pic:nvPicPr>
+                  <pic:blipFill>
+                    <a:blip r:embed="rId30"/>
+                    <a:stretch>
+                      <a:fillRect/>
+                    </a:stretch>
+                  </pic:blipFill>
+                  <pic:spPr>
+                    <a:xfrm>
+                      <a:off x="0" y="0"/>
+                      <a:ext cx="3644353" cy="1815168"/>
+                    </a:xfrm>
+                    <a:prstGeom prst="rect">
+                      <a:avLst/>
+                    </a:prstGeom>
+                  </pic:spPr>
+                </pic:pic>
+              </a:graphicData>
+            </a:graphic>
+          </wp:inline>
+        </w:drawing>
+      </w:r>
+    </w:p>
+    <w:p>
+      <w:pPr>
+        <w:pStyle w:val="NormalWeb"/>
+        <w:numPr>
+          <w:ilvl w:val="0"/>
+          <w:numId w:val="8"/>
+        </w:numPr>
+        <w:spacing w:before="0" w:beforeAutospacing="0"/>
+        <w:rPr>
+          <w:rFonts w:ascii="Arial" w:hAnsi="Arial" w:cs="Arial"/>
+          <w:sz w:val="20"/>
+          <w:szCs w:val="20"/>
+        </w:rPr>
+      </w:pPr>
+      <w:r>
+        <w:rPr>
+          <w:rFonts w:ascii="Arial" w:hAnsi="Arial" w:cs="Arial"/>
+          <w:sz w:val="20"/>
+          <w:szCs w:val="20"/>
+        </w:rPr>
+        <w:t xml:space="preserve">Checked a few more videos and confirmed that it had not had the effect I was hoping for of instant alignment </w:t>
+      </w:r>
+      <w:r>
+        <w:rPr>
+          <mc:AlternateContent>
+            <mc:Choice Requires="w16se">
+              <w:rFonts w:ascii="Arial" w:hAnsi="Arial" w:cs="Arial"/>
+            </mc:Choice>
+            <mc:Fallback>
+              <w:rFonts w:ascii="Segoe UI Emoji" w:eastAsia="Segoe UI Emoji" w:hAnsi="Segoe UI Emoji" w:cs="Segoe UI Emoji"/>
+            </mc:Fallback>
+          </mc:AlternateContent>
+          <w:sz w:val="20"/>
+          <w:szCs w:val="20"/>
+        </w:rPr>
+        <mc:AlternateContent>
+          <mc:Choice Requires="w16se">
+            <w16se:symEx w16se:font="Segoe UI Emoji" w16se:char="2639"/>
+          </mc:Choice>
+          <mc:Fallback>
+            <w:t>☹</w:t>
+          </mc:Fallback>
+        </mc:AlternateContent>
+      </w:r>
+      <w:r>
+        <w:rPr>
+          <w:rFonts w:ascii="Arial" w:hAnsi="Arial" w:cs="Arial"/>
+          <w:sz w:val="20"/>
+          <w:szCs w:val="20"/>
+        </w:rPr>
+        <w:t xml:space="preserve"> Need to recheck my work, fix the accelerometer, and try again next week.</w:t>
+      </w:r>
     </w:p>
     <w:sectPr>
-      <w:headerReference w:type="default" r:id="rId30"/>
+      <w:headerReference w:type="default" r:id="rId31"/>
       <w:pgSz w:w="12240" w:h="15840"/>
       <w:pgMar w:top="1440" w:right="1440" w:bottom="1440" w:left="1440" w:header="720" w:footer="720" w:gutter="0"/>
       <w:cols w:space="720"/>

</xml_diff>